<commit_message>
Modify adjustment factors for As, Aps, and fpo in LRFD Eq 5.7.3.4.2-4 (Mantis 1603) (#31)
</commit_message>
<xml_diff>
--- a/Equations/ex.docx
+++ b/Equations/ex.docx
@@ -1,6 +1,6 @@
 
 <file path=word/document.xml><?xml version="1.0" encoding="utf-8"?>
-<w:document xmlns:ve="http://schemas.openxmlformats.org/markup-compatibility/2006" xmlns:o="urn:schemas-microsoft-com:office:office" xmlns:r="http://schemas.openxmlformats.org/officeDocument/2006/relationships" xmlns:m="http://schemas.openxmlformats.org/officeDocument/2006/math" xmlns:v="urn:schemas-microsoft-com:vml" xmlns:wp="http://schemas.openxmlformats.org/drawingml/2006/wordprocessingDrawing" xmlns:w10="urn:schemas-microsoft-com:office:word" xmlns:w="http://schemas.openxmlformats.org/wordprocessingml/2006/main" xmlns:wne="http://schemas.microsoft.com/office/word/2006/wordml">
+<w:document xmlns:wpc="http://schemas.microsoft.com/office/word/2010/wordprocessingCanvas" xmlns:cx="http://schemas.microsoft.com/office/drawing/2014/chartex" xmlns:cx1="http://schemas.microsoft.com/office/drawing/2015/9/8/chartex" xmlns:cx2="http://schemas.microsoft.com/office/drawing/2015/10/21/chartex" xmlns:cx3="http://schemas.microsoft.com/office/drawing/2016/5/9/chartex" xmlns:cx4="http://schemas.microsoft.com/office/drawing/2016/5/10/chartex" xmlns:cx5="http://schemas.microsoft.com/office/drawing/2016/5/11/chartex" xmlns:cx6="http://schemas.microsoft.com/office/drawing/2016/5/12/chartex" xmlns:cx7="http://schemas.microsoft.com/office/drawing/2016/5/13/chartex" xmlns:cx8="http://schemas.microsoft.com/office/drawing/2016/5/14/chartex" xmlns:mc="http://schemas.openxmlformats.org/markup-compatibility/2006" xmlns:aink="http://schemas.microsoft.com/office/drawing/2016/ink" xmlns:am3d="http://schemas.microsoft.com/office/drawing/2017/model3d" xmlns:o="urn:schemas-microsoft-com:office:office" xmlns:oel="http://schemas.microsoft.com/office/2019/extlst" xmlns:r="http://schemas.openxmlformats.org/officeDocument/2006/relationships" xmlns:m="http://schemas.openxmlformats.org/officeDocument/2006/math" xmlns:v="urn:schemas-microsoft-com:vml" xmlns:wp14="http://schemas.microsoft.com/office/word/2010/wordprocessingDrawing" xmlns:wp="http://schemas.openxmlformats.org/drawingml/2006/wordprocessingDrawing" xmlns:w10="urn:schemas-microsoft-com:office:word" xmlns:w="http://schemas.openxmlformats.org/wordprocessingml/2006/main" xmlns:w14="http://schemas.microsoft.com/office/word/2010/wordml" xmlns:w15="http://schemas.microsoft.com/office/word/2012/wordml" xmlns:w16cex="http://schemas.microsoft.com/office/word/2018/wordml/cex" xmlns:w16cid="http://schemas.microsoft.com/office/word/2016/wordml/cid" xmlns:w16="http://schemas.microsoft.com/office/word/2018/wordml" xmlns:w16du="http://schemas.microsoft.com/office/word/2023/wordml/word16du" xmlns:w16sdtdh="http://schemas.microsoft.com/office/word/2020/wordml/sdtdatahash" xmlns:w16se="http://schemas.microsoft.com/office/word/2015/wordml/symex" xmlns:wpg="http://schemas.microsoft.com/office/word/2010/wordprocessingGroup" xmlns:wpi="http://schemas.microsoft.com/office/word/2010/wordprocessingInk" xmlns:wne="http://schemas.microsoft.com/office/word/2006/wordml" xmlns:wps="http://schemas.microsoft.com/office/word/2010/wordprocessingShape" mc:Ignorable="w14 w15 w16se w16cid w16 w16cex w16sdtdh w16du wp14">
   <w:body>
     <w:p>
       <w:pPr>
@@ -326,6 +326,32 @@
                             </m:ctrlPr>
                           </m:sSubPr>
                           <m:e>
+                            <m:sSub>
+                              <m:sSubPr>
+                                <m:ctrlPr>
+                                  <w:rPr>
+                                    <w:rFonts w:ascii="Cambria Math" w:hAnsi="Cambria Math"/>
+                                    <w:i/>
+                                  </w:rPr>
+                                </m:ctrlPr>
+                              </m:sSubPr>
+                              <m:e>
+                                <m:r>
+                                  <w:rPr>
+                                    <w:rFonts w:ascii="Cambria Math" w:hAnsi="Cambria Math"/>
+                                  </w:rPr>
+                                  <m:t>K</m:t>
+                                </m:r>
+                              </m:e>
+                              <m:sub>
+                                <m:r>
+                                  <w:rPr>
+                                    <w:rFonts w:ascii="Cambria Math" w:hAnsi="Cambria Math"/>
+                                  </w:rPr>
+                                  <m:t>dt</m:t>
+                                </m:r>
+                              </m:sub>
+                            </m:sSub>
                             <m:r>
                               <w:rPr>
                                 <w:rFonts w:ascii="Cambria Math" w:hAnsi="Cambria Math"/>
@@ -398,6 +424,32 @@
                             </m:ctrlPr>
                           </m:sSubPr>
                           <m:e>
+                            <m:sSub>
+                              <m:sSubPr>
+                                <m:ctrlPr>
+                                  <w:rPr>
+                                    <w:rFonts w:ascii="Cambria Math" w:hAnsi="Cambria Math"/>
+                                    <w:i/>
+                                  </w:rPr>
+                                </m:ctrlPr>
+                              </m:sSubPr>
+                              <m:e>
+                                <m:r>
+                                  <w:rPr>
+                                    <w:rFonts w:ascii="Cambria Math" w:hAnsi="Cambria Math"/>
+                                  </w:rPr>
+                                  <m:t>K</m:t>
+                                </m:r>
+                              </m:e>
+                              <m:sub>
+                                <m:r>
+                                  <w:rPr>
+                                    <w:rFonts w:ascii="Cambria Math" w:hAnsi="Cambria Math"/>
+                                  </w:rPr>
+                                  <m:t>db</m:t>
+                                </m:r>
+                              </m:sub>
+                            </m:sSub>
                             <m:r>
                               <w:rPr>
                                 <w:rFonts w:ascii="Cambria Math" w:hAnsi="Cambria Math"/>
@@ -443,6 +495,32 @@
                                 <w:rFonts w:ascii="Cambria Math" w:hAnsi="Cambria Math"/>
                               </w:rPr>
                               <m:t>p</m:t>
+                            </m:r>
+                          </m:sub>
+                        </m:sSub>
+                        <m:sSub>
+                          <m:sSubPr>
+                            <m:ctrlPr>
+                              <w:rPr>
+                                <w:rFonts w:ascii="Cambria Math" w:hAnsi="Cambria Math"/>
+                                <w:i/>
+                              </w:rPr>
+                            </m:ctrlPr>
+                          </m:sSubPr>
+                          <m:e>
+                            <m:r>
+                              <w:rPr>
+                                <w:rFonts w:ascii="Cambria Math" w:hAnsi="Cambria Math"/>
+                              </w:rPr>
+                              <m:t>K</m:t>
+                            </m:r>
+                          </m:e>
+                          <m:sub>
+                            <m:r>
+                              <w:rPr>
+                                <w:rFonts w:ascii="Cambria Math" w:hAnsi="Cambria Math"/>
+                              </w:rPr>
+                              <m:t>ds</m:t>
                             </m:r>
                           </m:sub>
                         </m:sSub>
@@ -791,6 +869,32 @@
                             </m:ctrlPr>
                           </m:sSubPr>
                           <m:e>
+                            <m:sSub>
+                              <m:sSubPr>
+                                <m:ctrlPr>
+                                  <w:rPr>
+                                    <w:rFonts w:ascii="Cambria Math" w:hAnsi="Cambria Math"/>
+                                    <w:i/>
+                                  </w:rPr>
+                                </m:ctrlPr>
+                              </m:sSubPr>
+                              <m:e>
+                                <m:r>
+                                  <w:rPr>
+                                    <w:rFonts w:ascii="Cambria Math" w:hAnsi="Cambria Math"/>
+                                  </w:rPr>
+                                  <m:t>K</m:t>
+                                </m:r>
+                              </m:e>
+                              <m:sub>
+                                <m:r>
+                                  <w:rPr>
+                                    <w:rFonts w:ascii="Cambria Math" w:hAnsi="Cambria Math"/>
+                                  </w:rPr>
+                                  <m:t>dt</m:t>
+                                </m:r>
+                              </m:sub>
+                            </m:sSub>
                             <m:r>
                               <w:rPr>
                                 <w:rFonts w:ascii="Cambria Math" w:hAnsi="Cambria Math"/>
@@ -847,6 +951,32 @@
                         </m:ctrlPr>
                       </m:sSubPr>
                       <m:e>
+                        <m:sSub>
+                          <m:sSubPr>
+                            <m:ctrlPr>
+                              <w:rPr>
+                                <w:rFonts w:ascii="Cambria Math" w:hAnsi="Cambria Math"/>
+                                <w:i/>
+                              </w:rPr>
+                            </m:ctrlPr>
+                          </m:sSubPr>
+                          <m:e>
+                            <m:r>
+                              <w:rPr>
+                                <w:rFonts w:ascii="Cambria Math" w:hAnsi="Cambria Math"/>
+                              </w:rPr>
+                              <m:t>K</m:t>
+                            </m:r>
+                          </m:e>
+                          <m:sub>
+                            <m:r>
+                              <w:rPr>
+                                <w:rFonts w:ascii="Cambria Math" w:hAnsi="Cambria Math"/>
+                              </w:rPr>
+                              <m:t>db</m:t>
+                            </m:r>
+                          </m:sub>
+                        </m:sSub>
                         <m:r>
                           <w:rPr>
                             <w:rFonts w:ascii="Cambria Math" w:hAnsi="Cambria Math"/>
@@ -892,6 +1022,32 @@
                             <w:rFonts w:ascii="Cambria Math" w:hAnsi="Cambria Math"/>
                           </w:rPr>
                           <m:t>p</m:t>
+                        </m:r>
+                      </m:sub>
+                    </m:sSub>
+                    <m:sSub>
+                      <m:sSubPr>
+                        <m:ctrlPr>
+                          <w:rPr>
+                            <w:rFonts w:ascii="Cambria Math" w:hAnsi="Cambria Math"/>
+                            <w:i/>
+                          </w:rPr>
+                        </m:ctrlPr>
+                      </m:sSubPr>
+                      <m:e>
+                        <m:r>
+                          <w:rPr>
+                            <w:rFonts w:ascii="Cambria Math" w:hAnsi="Cambria Math"/>
+                          </w:rPr>
+                          <m:t>K</m:t>
+                        </m:r>
+                      </m:e>
+                      <m:sub>
+                        <m:r>
+                          <w:rPr>
+                            <w:rFonts w:ascii="Cambria Math" w:hAnsi="Cambria Math"/>
+                          </w:rPr>
+                          <m:t>ds</m:t>
                         </m:r>
                       </m:sub>
                     </m:sSub>
@@ -1238,6 +1394,32 @@
                             </m:ctrlPr>
                           </m:sSubPr>
                           <m:e>
+                            <m:sSub>
+                              <m:sSubPr>
+                                <m:ctrlPr>
+                                  <w:rPr>
+                                    <w:rFonts w:ascii="Cambria Math" w:hAnsi="Cambria Math"/>
+                                    <w:i/>
+                                  </w:rPr>
+                                </m:ctrlPr>
+                              </m:sSubPr>
+                              <m:e>
+                                <m:r>
+                                  <w:rPr>
+                                    <w:rFonts w:ascii="Cambria Math" w:hAnsi="Cambria Math"/>
+                                  </w:rPr>
+                                  <m:t>K</m:t>
+                                </m:r>
+                              </m:e>
+                              <m:sub>
+                                <m:r>
+                                  <w:rPr>
+                                    <w:rFonts w:ascii="Cambria Math" w:hAnsi="Cambria Math"/>
+                                  </w:rPr>
+                                  <m:t>dt</m:t>
+                                </m:r>
+                              </m:sub>
+                            </m:sSub>
                             <m:r>
                               <w:rPr>
                                 <w:rFonts w:ascii="Cambria Math" w:hAnsi="Cambria Math"/>
@@ -1284,6 +1466,90 @@
                             </m:ctrlPr>
                           </m:sSubPr>
                           <m:e>
+                            <m:r>
+                              <w:rPr>
+                                <w:rFonts w:ascii="Cambria Math" w:hAnsi="Cambria Math"/>
+                              </w:rPr>
+                              <m:t>E</m:t>
+                            </m:r>
+                          </m:e>
+                          <m:sub>
+                            <m:r>
+                              <w:rPr>
+                                <w:rFonts w:ascii="Cambria Math" w:hAnsi="Cambria Math"/>
+                              </w:rPr>
+                              <m:t>c</m:t>
+                            </m:r>
+                          </m:sub>
+                        </m:sSub>
+                        <m:sSub>
+                          <m:sSubPr>
+                            <m:ctrlPr>
+                              <w:rPr>
+                                <w:rFonts w:ascii="Cambria Math" w:hAnsi="Cambria Math"/>
+                                <w:i/>
+                              </w:rPr>
+                            </m:ctrlPr>
+                          </m:sSubPr>
+                          <m:e>
+                            <m:r>
+                              <w:rPr>
+                                <w:rFonts w:ascii="Cambria Math" w:hAnsi="Cambria Math"/>
+                              </w:rPr>
+                              <m:t>A</m:t>
+                            </m:r>
+                          </m:e>
+                          <m:sub>
+                            <m:r>
+                              <w:rPr>
+                                <w:rFonts w:ascii="Cambria Math" w:hAnsi="Cambria Math"/>
+                              </w:rPr>
+                              <m:t>c</m:t>
+                            </m:r>
+                          </m:sub>
+                        </m:sSub>
+                        <m:r>
+                          <w:rPr>
+                            <w:rFonts w:ascii="Cambria Math" w:hAnsi="Cambria Math"/>
+                          </w:rPr>
+                          <m:t xml:space="preserve">+ </m:t>
+                        </m:r>
+                        <m:sSub>
+                          <m:sSubPr>
+                            <m:ctrlPr>
+                              <w:rPr>
+                                <w:rFonts w:ascii="Cambria Math" w:hAnsi="Cambria Math"/>
+                                <w:i/>
+                              </w:rPr>
+                            </m:ctrlPr>
+                          </m:sSubPr>
+                          <m:e>
+                            <m:r>
+                              <w:rPr>
+                                <w:rFonts w:ascii="Cambria Math" w:hAnsi="Cambria Math"/>
+                              </w:rPr>
+                              <m:t>E</m:t>
+                            </m:r>
+                          </m:e>
+                          <m:sub>
+                            <m:r>
+                              <w:rPr>
+                                <w:rFonts w:ascii="Cambria Math" w:hAnsi="Cambria Math"/>
+                              </w:rPr>
+                              <m:t>s</m:t>
+                            </m:r>
+                          </m:sub>
+                        </m:sSub>
+                        <m:sSub>
+                          <m:sSubPr>
+                            <m:ctrlPr>
+                              <w:rPr>
+                                <w:rFonts w:ascii="Cambria Math" w:hAnsi="Cambria Math"/>
+                                <w:i/>
+                              </w:rPr>
+                            </m:ctrlPr>
+                          </m:sSubPr>
+                          <m:e>
                             <m:sSub>
                               <m:sSubPr>
                                 <m:ctrlPr>
@@ -1298,7 +1564,7 @@
                                   <w:rPr>
                                     <w:rFonts w:ascii="Cambria Math" w:hAnsi="Cambria Math"/>
                                   </w:rPr>
-                                  <m:t>E</m:t>
+                                  <m:t>K</m:t>
                                 </m:r>
                               </m:e>
                               <m:sub>
@@ -1306,41 +1572,15 @@
                                   <w:rPr>
                                     <w:rFonts w:ascii="Cambria Math" w:hAnsi="Cambria Math"/>
                                   </w:rPr>
-                                  <m:t>c</m:t>
+                                  <m:t>db</m:t>
                                 </m:r>
                               </m:sub>
                             </m:sSub>
-                            <m:sSub>
-                              <m:sSubPr>
-                                <m:ctrlPr>
-                                  <w:rPr>
-                                    <w:rFonts w:ascii="Cambria Math" w:hAnsi="Cambria Math"/>
-                                    <w:i/>
-                                  </w:rPr>
-                                </m:ctrlPr>
-                              </m:sSubPr>
-                              <m:e>
-                                <m:r>
-                                  <w:rPr>
-                                    <w:rFonts w:ascii="Cambria Math" w:hAnsi="Cambria Math"/>
-                                  </w:rPr>
-                                  <m:t>A</m:t>
-                                </m:r>
-                              </m:e>
-                              <m:sub>
-                                <m:r>
-                                  <w:rPr>
-                                    <w:rFonts w:ascii="Cambria Math" w:hAnsi="Cambria Math"/>
-                                  </w:rPr>
-                                  <m:t>c</m:t>
-                                </m:r>
-                              </m:sub>
-                            </m:sSub>
-                            <m:r>
-                              <w:rPr>
-                                <w:rFonts w:ascii="Cambria Math" w:hAnsi="Cambria Math"/>
-                              </w:rPr>
-                              <m:t>+E</m:t>
+                            <m:r>
+                              <w:rPr>
+                                <w:rFonts w:ascii="Cambria Math" w:hAnsi="Cambria Math"/>
+                              </w:rPr>
+                              <m:t>A</m:t>
                             </m:r>
                           </m:e>
                           <m:sub>
@@ -1352,32 +1592,6 @@
                             </m:r>
                           </m:sub>
                         </m:sSub>
-                        <m:sSub>
-                          <m:sSubPr>
-                            <m:ctrlPr>
-                              <w:rPr>
-                                <w:rFonts w:ascii="Cambria Math" w:hAnsi="Cambria Math"/>
-                                <w:i/>
-                              </w:rPr>
-                            </m:ctrlPr>
-                          </m:sSubPr>
-                          <m:e>
-                            <m:r>
-                              <w:rPr>
-                                <w:rFonts w:ascii="Cambria Math" w:hAnsi="Cambria Math"/>
-                              </w:rPr>
-                              <m:t>A</m:t>
-                            </m:r>
-                          </m:e>
-                          <m:sub>
-                            <m:r>
-                              <w:rPr>
-                                <w:rFonts w:ascii="Cambria Math" w:hAnsi="Cambria Math"/>
-                              </w:rPr>
-                              <m:t>s</m:t>
-                            </m:r>
-                          </m:sub>
-                        </m:sSub>
                         <m:r>
                           <w:rPr>
                             <w:rFonts w:ascii="Cambria Math" w:hAnsi="Cambria Math"/>
@@ -1407,6 +1621,32 @@
                                 <w:rFonts w:ascii="Cambria Math" w:hAnsi="Cambria Math"/>
                               </w:rPr>
                               <m:t>p</m:t>
+                            </m:r>
+                          </m:sub>
+                        </m:sSub>
+                        <m:sSub>
+                          <m:sSubPr>
+                            <m:ctrlPr>
+                              <w:rPr>
+                                <w:rFonts w:ascii="Cambria Math" w:hAnsi="Cambria Math"/>
+                                <w:i/>
+                              </w:rPr>
+                            </m:ctrlPr>
+                          </m:sSubPr>
+                          <m:e>
+                            <m:r>
+                              <w:rPr>
+                                <w:rFonts w:ascii="Cambria Math" w:hAnsi="Cambria Math"/>
+                              </w:rPr>
+                              <m:t>K</m:t>
+                            </m:r>
+                          </m:e>
+                          <m:sub>
+                            <m:r>
+                              <w:rPr>
+                                <w:rFonts w:ascii="Cambria Math" w:hAnsi="Cambria Math"/>
+                              </w:rPr>
+                              <m:t>ds</m:t>
                             </m:r>
                           </m:sub>
                         </m:sSub>
@@ -1778,6 +2018,32 @@
                             </m:ctrlPr>
                           </m:sSubPr>
                           <m:e>
+                            <m:sSub>
+                              <m:sSubPr>
+                                <m:ctrlPr>
+                                  <w:rPr>
+                                    <w:rFonts w:ascii="Cambria Math" w:hAnsi="Cambria Math"/>
+                                    <w:i/>
+                                  </w:rPr>
+                                </m:ctrlPr>
+                              </m:sSubPr>
+                              <m:e>
+                                <m:r>
+                                  <w:rPr>
+                                    <w:rFonts w:ascii="Cambria Math" w:hAnsi="Cambria Math"/>
+                                  </w:rPr>
+                                  <m:t>K</m:t>
+                                </m:r>
+                              </m:e>
+                              <m:sub>
+                                <m:r>
+                                  <w:rPr>
+                                    <w:rFonts w:ascii="Cambria Math" w:hAnsi="Cambria Math"/>
+                                  </w:rPr>
+                                  <m:t>dt</m:t>
+                                </m:r>
+                              </m:sub>
+                            </m:sSub>
                             <m:r>
                               <w:rPr>
                                 <w:rFonts w:ascii="Cambria Math" w:hAnsi="Cambria Math"/>
@@ -1850,6 +2116,32 @@
                             </m:ctrlPr>
                           </m:sSubPr>
                           <m:e>
+                            <m:sSub>
+                              <m:sSubPr>
+                                <m:ctrlPr>
+                                  <w:rPr>
+                                    <w:rFonts w:ascii="Cambria Math" w:hAnsi="Cambria Math"/>
+                                    <w:i/>
+                                  </w:rPr>
+                                </m:ctrlPr>
+                              </m:sSubPr>
+                              <m:e>
+                                <m:r>
+                                  <w:rPr>
+                                    <w:rFonts w:ascii="Cambria Math" w:hAnsi="Cambria Math"/>
+                                  </w:rPr>
+                                  <m:t>K</m:t>
+                                </m:r>
+                              </m:e>
+                              <m:sub>
+                                <m:r>
+                                  <w:rPr>
+                                    <w:rFonts w:ascii="Cambria Math" w:hAnsi="Cambria Math"/>
+                                  </w:rPr>
+                                  <m:t>db</m:t>
+                                </m:r>
+                              </m:sub>
+                            </m:sSub>
                             <m:r>
                               <w:rPr>
                                 <w:rFonts w:ascii="Cambria Math" w:hAnsi="Cambria Math"/>
@@ -1895,6 +2187,32 @@
                                 <w:rFonts w:ascii="Cambria Math" w:hAnsi="Cambria Math"/>
                               </w:rPr>
                               <m:t>p</m:t>
+                            </m:r>
+                          </m:sub>
+                        </m:sSub>
+                        <m:sSub>
+                          <m:sSubPr>
+                            <m:ctrlPr>
+                              <w:rPr>
+                                <w:rFonts w:ascii="Cambria Math" w:hAnsi="Cambria Math"/>
+                                <w:i/>
+                              </w:rPr>
+                            </m:ctrlPr>
+                          </m:sSubPr>
+                          <m:e>
+                            <m:r>
+                              <w:rPr>
+                                <w:rFonts w:ascii="Cambria Math" w:hAnsi="Cambria Math"/>
+                              </w:rPr>
+                              <m:t>K</m:t>
+                            </m:r>
+                          </m:e>
+                          <m:sub>
+                            <m:r>
+                              <w:rPr>
+                                <w:rFonts w:ascii="Cambria Math" w:hAnsi="Cambria Math"/>
+                              </w:rPr>
+                              <m:t>ds</m:t>
                             </m:r>
                           </m:sub>
                         </m:sSub>
@@ -2243,6 +2561,32 @@
                             </m:ctrlPr>
                           </m:sSubPr>
                           <m:e>
+                            <m:sSub>
+                              <m:sSubPr>
+                                <m:ctrlPr>
+                                  <w:rPr>
+                                    <w:rFonts w:ascii="Cambria Math" w:hAnsi="Cambria Math"/>
+                                    <w:i/>
+                                  </w:rPr>
+                                </m:ctrlPr>
+                              </m:sSubPr>
+                              <m:e>
+                                <m:r>
+                                  <w:rPr>
+                                    <w:rFonts w:ascii="Cambria Math" w:hAnsi="Cambria Math"/>
+                                  </w:rPr>
+                                  <m:t>K</m:t>
+                                </m:r>
+                              </m:e>
+                              <m:sub>
+                                <m:r>
+                                  <w:rPr>
+                                    <w:rFonts w:ascii="Cambria Math" w:hAnsi="Cambria Math"/>
+                                  </w:rPr>
+                                  <m:t>dt</m:t>
+                                </m:r>
+                              </m:sub>
+                            </m:sSub>
                             <m:r>
                               <w:rPr>
                                 <w:rFonts w:ascii="Cambria Math" w:hAnsi="Cambria Math"/>
@@ -2299,6 +2643,32 @@
                         </m:ctrlPr>
                       </m:sSubPr>
                       <m:e>
+                        <m:sSub>
+                          <m:sSubPr>
+                            <m:ctrlPr>
+                              <w:rPr>
+                                <w:rFonts w:ascii="Cambria Math" w:hAnsi="Cambria Math"/>
+                                <w:i/>
+                              </w:rPr>
+                            </m:ctrlPr>
+                          </m:sSubPr>
+                          <m:e>
+                            <m:r>
+                              <w:rPr>
+                                <w:rFonts w:ascii="Cambria Math" w:hAnsi="Cambria Math"/>
+                              </w:rPr>
+                              <m:t>K</m:t>
+                            </m:r>
+                          </m:e>
+                          <m:sub>
+                            <m:r>
+                              <w:rPr>
+                                <w:rFonts w:ascii="Cambria Math" w:hAnsi="Cambria Math"/>
+                              </w:rPr>
+                              <m:t>db</m:t>
+                            </m:r>
+                          </m:sub>
+                        </m:sSub>
                         <m:r>
                           <w:rPr>
                             <w:rFonts w:ascii="Cambria Math" w:hAnsi="Cambria Math"/>
@@ -2344,6 +2714,32 @@
                             <w:rFonts w:ascii="Cambria Math" w:hAnsi="Cambria Math"/>
                           </w:rPr>
                           <m:t>p</m:t>
+                        </m:r>
+                      </m:sub>
+                    </m:sSub>
+                    <m:sSub>
+                      <m:sSubPr>
+                        <m:ctrlPr>
+                          <w:rPr>
+                            <w:rFonts w:ascii="Cambria Math" w:hAnsi="Cambria Math"/>
+                            <w:i/>
+                          </w:rPr>
+                        </m:ctrlPr>
+                      </m:sSubPr>
+                      <m:e>
+                        <m:r>
+                          <w:rPr>
+                            <w:rFonts w:ascii="Cambria Math" w:hAnsi="Cambria Math"/>
+                          </w:rPr>
+                          <m:t>K</m:t>
+                        </m:r>
+                      </m:e>
+                      <m:sub>
+                        <m:r>
+                          <w:rPr>
+                            <w:rFonts w:ascii="Cambria Math" w:hAnsi="Cambria Math"/>
+                          </w:rPr>
+                          <m:t>ds</m:t>
                         </m:r>
                       </m:sub>
                     </m:sSub>
@@ -2690,6 +3086,32 @@
                             </m:ctrlPr>
                           </m:sSubPr>
                           <m:e>
+                            <m:sSub>
+                              <m:sSubPr>
+                                <m:ctrlPr>
+                                  <w:rPr>
+                                    <w:rFonts w:ascii="Cambria Math" w:hAnsi="Cambria Math"/>
+                                    <w:i/>
+                                  </w:rPr>
+                                </m:ctrlPr>
+                              </m:sSubPr>
+                              <m:e>
+                                <m:r>
+                                  <w:rPr>
+                                    <w:rFonts w:ascii="Cambria Math" w:hAnsi="Cambria Math"/>
+                                  </w:rPr>
+                                  <m:t>K</m:t>
+                                </m:r>
+                              </m:e>
+                              <m:sub>
+                                <m:r>
+                                  <w:rPr>
+                                    <w:rFonts w:ascii="Cambria Math" w:hAnsi="Cambria Math"/>
+                                  </w:rPr>
+                                  <m:t>dt</m:t>
+                                </m:r>
+                              </m:sub>
+                            </m:sSub>
                             <m:r>
                               <w:rPr>
                                 <w:rFonts w:ascii="Cambria Math" w:hAnsi="Cambria Math"/>
@@ -2736,6 +3158,90 @@
                             </m:ctrlPr>
                           </m:sSubPr>
                           <m:e>
+                            <m:r>
+                              <w:rPr>
+                                <w:rFonts w:ascii="Cambria Math" w:hAnsi="Cambria Math"/>
+                              </w:rPr>
+                              <m:t>E</m:t>
+                            </m:r>
+                          </m:e>
+                          <m:sub>
+                            <m:r>
+                              <w:rPr>
+                                <w:rFonts w:ascii="Cambria Math" w:hAnsi="Cambria Math"/>
+                              </w:rPr>
+                              <m:t>c</m:t>
+                            </m:r>
+                          </m:sub>
+                        </m:sSub>
+                        <m:sSub>
+                          <m:sSubPr>
+                            <m:ctrlPr>
+                              <w:rPr>
+                                <w:rFonts w:ascii="Cambria Math" w:hAnsi="Cambria Math"/>
+                                <w:i/>
+                              </w:rPr>
+                            </m:ctrlPr>
+                          </m:sSubPr>
+                          <m:e>
+                            <m:r>
+                              <w:rPr>
+                                <w:rFonts w:ascii="Cambria Math" w:hAnsi="Cambria Math"/>
+                              </w:rPr>
+                              <m:t>A</m:t>
+                            </m:r>
+                          </m:e>
+                          <m:sub>
+                            <m:r>
+                              <w:rPr>
+                                <w:rFonts w:ascii="Cambria Math" w:hAnsi="Cambria Math"/>
+                              </w:rPr>
+                              <m:t>c</m:t>
+                            </m:r>
+                          </m:sub>
+                        </m:sSub>
+                        <m:r>
+                          <w:rPr>
+                            <w:rFonts w:ascii="Cambria Math" w:hAnsi="Cambria Math"/>
+                          </w:rPr>
+                          <m:t xml:space="preserve">+ </m:t>
+                        </m:r>
+                        <m:sSub>
+                          <m:sSubPr>
+                            <m:ctrlPr>
+                              <w:rPr>
+                                <w:rFonts w:ascii="Cambria Math" w:hAnsi="Cambria Math"/>
+                                <w:i/>
+                              </w:rPr>
+                            </m:ctrlPr>
+                          </m:sSubPr>
+                          <m:e>
+                            <m:r>
+                              <w:rPr>
+                                <w:rFonts w:ascii="Cambria Math" w:hAnsi="Cambria Math"/>
+                              </w:rPr>
+                              <m:t>E</m:t>
+                            </m:r>
+                          </m:e>
+                          <m:sub>
+                            <m:r>
+                              <w:rPr>
+                                <w:rFonts w:ascii="Cambria Math" w:hAnsi="Cambria Math"/>
+                              </w:rPr>
+                              <m:t>s</m:t>
+                            </m:r>
+                          </m:sub>
+                        </m:sSub>
+                        <m:sSub>
+                          <m:sSubPr>
+                            <m:ctrlPr>
+                              <w:rPr>
+                                <w:rFonts w:ascii="Cambria Math" w:hAnsi="Cambria Math"/>
+                                <w:i/>
+                              </w:rPr>
+                            </m:ctrlPr>
+                          </m:sSubPr>
+                          <m:e>
                             <m:sSub>
                               <m:sSubPr>
                                 <m:ctrlPr>
@@ -2750,7 +3256,7 @@
                                   <w:rPr>
                                     <w:rFonts w:ascii="Cambria Math" w:hAnsi="Cambria Math"/>
                                   </w:rPr>
-                                  <m:t>E</m:t>
+                                  <m:t>K</m:t>
                                 </m:r>
                               </m:e>
                               <m:sub>
@@ -2758,41 +3264,15 @@
                                   <w:rPr>
                                     <w:rFonts w:ascii="Cambria Math" w:hAnsi="Cambria Math"/>
                                   </w:rPr>
-                                  <m:t>c</m:t>
+                                  <m:t>db</m:t>
                                 </m:r>
                               </m:sub>
                             </m:sSub>
-                            <m:sSub>
-                              <m:sSubPr>
-                                <m:ctrlPr>
-                                  <w:rPr>
-                                    <w:rFonts w:ascii="Cambria Math" w:hAnsi="Cambria Math"/>
-                                    <w:i/>
-                                  </w:rPr>
-                                </m:ctrlPr>
-                              </m:sSubPr>
-                              <m:e>
-                                <m:r>
-                                  <w:rPr>
-                                    <w:rFonts w:ascii="Cambria Math" w:hAnsi="Cambria Math"/>
-                                  </w:rPr>
-                                  <m:t>A</m:t>
-                                </m:r>
-                              </m:e>
-                              <m:sub>
-                                <m:r>
-                                  <w:rPr>
-                                    <w:rFonts w:ascii="Cambria Math" w:hAnsi="Cambria Math"/>
-                                  </w:rPr>
-                                  <m:t>c</m:t>
-                                </m:r>
-                              </m:sub>
-                            </m:sSub>
-                            <m:r>
-                              <w:rPr>
-                                <w:rFonts w:ascii="Cambria Math" w:hAnsi="Cambria Math"/>
-                              </w:rPr>
-                              <m:t>+E</m:t>
+                            <m:r>
+                              <w:rPr>
+                                <w:rFonts w:ascii="Cambria Math" w:hAnsi="Cambria Math"/>
+                              </w:rPr>
+                              <m:t>A</m:t>
                             </m:r>
                           </m:e>
                           <m:sub>
@@ -2804,32 +3284,6 @@
                             </m:r>
                           </m:sub>
                         </m:sSub>
-                        <m:sSub>
-                          <m:sSubPr>
-                            <m:ctrlPr>
-                              <w:rPr>
-                                <w:rFonts w:ascii="Cambria Math" w:hAnsi="Cambria Math"/>
-                                <w:i/>
-                              </w:rPr>
-                            </m:ctrlPr>
-                          </m:sSubPr>
-                          <m:e>
-                            <m:r>
-                              <w:rPr>
-                                <w:rFonts w:ascii="Cambria Math" w:hAnsi="Cambria Math"/>
-                              </w:rPr>
-                              <m:t>A</m:t>
-                            </m:r>
-                          </m:e>
-                          <m:sub>
-                            <m:r>
-                              <w:rPr>
-                                <w:rFonts w:ascii="Cambria Math" w:hAnsi="Cambria Math"/>
-                              </w:rPr>
-                              <m:t>s</m:t>
-                            </m:r>
-                          </m:sub>
-                        </m:sSub>
                         <m:r>
                           <w:rPr>
                             <w:rFonts w:ascii="Cambria Math" w:hAnsi="Cambria Math"/>
@@ -2859,6 +3313,32 @@
                                 <w:rFonts w:ascii="Cambria Math" w:hAnsi="Cambria Math"/>
                               </w:rPr>
                               <m:t>p</m:t>
+                            </m:r>
+                          </m:sub>
+                        </m:sSub>
+                        <m:sSub>
+                          <m:sSubPr>
+                            <m:ctrlPr>
+                              <w:rPr>
+                                <w:rFonts w:ascii="Cambria Math" w:hAnsi="Cambria Math"/>
+                                <w:i/>
+                              </w:rPr>
+                            </m:ctrlPr>
+                          </m:sSubPr>
+                          <m:e>
+                            <m:r>
+                              <w:rPr>
+                                <w:rFonts w:ascii="Cambria Math" w:hAnsi="Cambria Math"/>
+                              </w:rPr>
+                              <m:t>K</m:t>
+                            </m:r>
+                          </m:e>
+                          <m:sub>
+                            <m:r>
+                              <w:rPr>
+                                <w:rFonts w:ascii="Cambria Math" w:hAnsi="Cambria Math"/>
+                              </w:rPr>
+                              <m:t>ds</m:t>
                             </m:r>
                           </m:sub>
                         </m:sSub>
@@ -3232,6 +3712,32 @@
                             </m:ctrlPr>
                           </m:sSubPr>
                           <m:e>
+                            <m:sSub>
+                              <m:sSubPr>
+                                <m:ctrlPr>
+                                  <w:rPr>
+                                    <w:rFonts w:ascii="Cambria Math" w:hAnsi="Cambria Math"/>
+                                    <w:i/>
+                                  </w:rPr>
+                                </m:ctrlPr>
+                              </m:sSubPr>
+                              <m:e>
+                                <m:r>
+                                  <w:rPr>
+                                    <w:rFonts w:ascii="Cambria Math" w:hAnsi="Cambria Math"/>
+                                  </w:rPr>
+                                  <m:t>K</m:t>
+                                </m:r>
+                              </m:e>
+                              <m:sub>
+                                <m:r>
+                                  <w:rPr>
+                                    <w:rFonts w:ascii="Cambria Math" w:hAnsi="Cambria Math"/>
+                                  </w:rPr>
+                                  <m:t>dt</m:t>
+                                </m:r>
+                              </m:sub>
+                            </m:sSub>
                             <m:r>
                               <w:rPr>
                                 <w:rFonts w:ascii="Cambria Math" w:hAnsi="Cambria Math"/>
@@ -3304,6 +3810,32 @@
                             </m:ctrlPr>
                           </m:sSubPr>
                           <m:e>
+                            <m:sSub>
+                              <m:sSubPr>
+                                <m:ctrlPr>
+                                  <w:rPr>
+                                    <w:rFonts w:ascii="Cambria Math" w:hAnsi="Cambria Math"/>
+                                    <w:i/>
+                                  </w:rPr>
+                                </m:ctrlPr>
+                              </m:sSubPr>
+                              <m:e>
+                                <m:r>
+                                  <w:rPr>
+                                    <w:rFonts w:ascii="Cambria Math" w:hAnsi="Cambria Math"/>
+                                  </w:rPr>
+                                  <m:t>K</m:t>
+                                </m:r>
+                              </m:e>
+                              <m:sub>
+                                <m:r>
+                                  <w:rPr>
+                                    <w:rFonts w:ascii="Cambria Math" w:hAnsi="Cambria Math"/>
+                                  </w:rPr>
+                                  <m:t>db</m:t>
+                                </m:r>
+                              </m:sub>
+                            </m:sSub>
                             <m:r>
                               <w:rPr>
                                 <w:rFonts w:ascii="Cambria Math" w:hAnsi="Cambria Math"/>
@@ -3349,6 +3881,32 @@
                                 <w:rFonts w:ascii="Cambria Math" w:hAnsi="Cambria Math"/>
                               </w:rPr>
                               <m:t>p</m:t>
+                            </m:r>
+                          </m:sub>
+                        </m:sSub>
+                        <m:sSub>
+                          <m:sSubPr>
+                            <m:ctrlPr>
+                              <w:rPr>
+                                <w:rFonts w:ascii="Cambria Math" w:hAnsi="Cambria Math"/>
+                                <w:i/>
+                              </w:rPr>
+                            </m:ctrlPr>
+                          </m:sSubPr>
+                          <m:e>
+                            <m:r>
+                              <w:rPr>
+                                <w:rFonts w:ascii="Cambria Math" w:hAnsi="Cambria Math"/>
+                              </w:rPr>
+                              <m:t>K</m:t>
+                            </m:r>
+                          </m:e>
+                          <m:sub>
+                            <m:r>
+                              <w:rPr>
+                                <w:rFonts w:ascii="Cambria Math" w:hAnsi="Cambria Math"/>
+                              </w:rPr>
+                              <m:t>ds</m:t>
                             </m:r>
                           </m:sub>
                         </m:sSub>
@@ -3699,6 +4257,32 @@
                             </m:ctrlPr>
                           </m:sSubPr>
                           <m:e>
+                            <m:sSub>
+                              <m:sSubPr>
+                                <m:ctrlPr>
+                                  <w:rPr>
+                                    <w:rFonts w:ascii="Cambria Math" w:hAnsi="Cambria Math"/>
+                                    <w:i/>
+                                  </w:rPr>
+                                </m:ctrlPr>
+                              </m:sSubPr>
+                              <m:e>
+                                <m:r>
+                                  <w:rPr>
+                                    <w:rFonts w:ascii="Cambria Math" w:hAnsi="Cambria Math"/>
+                                  </w:rPr>
+                                  <m:t>K</m:t>
+                                </m:r>
+                              </m:e>
+                              <m:sub>
+                                <m:r>
+                                  <w:rPr>
+                                    <w:rFonts w:ascii="Cambria Math" w:hAnsi="Cambria Math"/>
+                                  </w:rPr>
+                                  <m:t>dt</m:t>
+                                </m:r>
+                              </m:sub>
+                            </m:sSub>
                             <m:r>
                               <w:rPr>
                                 <w:rFonts w:ascii="Cambria Math" w:hAnsi="Cambria Math"/>
@@ -3755,6 +4339,32 @@
                         </m:ctrlPr>
                       </m:sSubPr>
                       <m:e>
+                        <m:sSub>
+                          <m:sSubPr>
+                            <m:ctrlPr>
+                              <w:rPr>
+                                <w:rFonts w:ascii="Cambria Math" w:hAnsi="Cambria Math"/>
+                                <w:i/>
+                              </w:rPr>
+                            </m:ctrlPr>
+                          </m:sSubPr>
+                          <m:e>
+                            <m:r>
+                              <w:rPr>
+                                <w:rFonts w:ascii="Cambria Math" w:hAnsi="Cambria Math"/>
+                              </w:rPr>
+                              <m:t>K</m:t>
+                            </m:r>
+                          </m:e>
+                          <m:sub>
+                            <m:r>
+                              <w:rPr>
+                                <w:rFonts w:ascii="Cambria Math" w:hAnsi="Cambria Math"/>
+                              </w:rPr>
+                              <m:t>db</m:t>
+                            </m:r>
+                          </m:sub>
+                        </m:sSub>
                         <m:r>
                           <w:rPr>
                             <w:rFonts w:ascii="Cambria Math" w:hAnsi="Cambria Math"/>
@@ -3800,6 +4410,32 @@
                             <w:rFonts w:ascii="Cambria Math" w:hAnsi="Cambria Math"/>
                           </w:rPr>
                           <m:t>p</m:t>
+                        </m:r>
+                      </m:sub>
+                    </m:sSub>
+                    <m:sSub>
+                      <m:sSubPr>
+                        <m:ctrlPr>
+                          <w:rPr>
+                            <w:rFonts w:ascii="Cambria Math" w:hAnsi="Cambria Math"/>
+                            <w:i/>
+                          </w:rPr>
+                        </m:ctrlPr>
+                      </m:sSubPr>
+                      <m:e>
+                        <m:r>
+                          <w:rPr>
+                            <w:rFonts w:ascii="Cambria Math" w:hAnsi="Cambria Math"/>
+                          </w:rPr>
+                          <m:t>K</m:t>
+                        </m:r>
+                      </m:e>
+                      <m:sub>
+                        <m:r>
+                          <w:rPr>
+                            <w:rFonts w:ascii="Cambria Math" w:hAnsi="Cambria Math"/>
+                          </w:rPr>
+                          <m:t>ds</m:t>
                         </m:r>
                       </m:sub>
                     </m:sSub>
@@ -4148,6 +4784,32 @@
                             </m:ctrlPr>
                           </m:sSubPr>
                           <m:e>
+                            <m:sSub>
+                              <m:sSubPr>
+                                <m:ctrlPr>
+                                  <w:rPr>
+                                    <w:rFonts w:ascii="Cambria Math" w:hAnsi="Cambria Math"/>
+                                    <w:i/>
+                                  </w:rPr>
+                                </m:ctrlPr>
+                              </m:sSubPr>
+                              <m:e>
+                                <m:r>
+                                  <w:rPr>
+                                    <w:rFonts w:ascii="Cambria Math" w:hAnsi="Cambria Math"/>
+                                  </w:rPr>
+                                  <m:t>K</m:t>
+                                </m:r>
+                              </m:e>
+                              <m:sub>
+                                <m:r>
+                                  <w:rPr>
+                                    <w:rFonts w:ascii="Cambria Math" w:hAnsi="Cambria Math"/>
+                                  </w:rPr>
+                                  <m:t>dt</m:t>
+                                </m:r>
+                              </m:sub>
+                            </m:sSub>
                             <m:r>
                               <w:rPr>
                                 <w:rFonts w:ascii="Cambria Math" w:hAnsi="Cambria Math"/>
@@ -4194,6 +4856,90 @@
                             </m:ctrlPr>
                           </m:sSubPr>
                           <m:e>
+                            <m:r>
+                              <w:rPr>
+                                <w:rFonts w:ascii="Cambria Math" w:hAnsi="Cambria Math"/>
+                              </w:rPr>
+                              <m:t>E</m:t>
+                            </m:r>
+                          </m:e>
+                          <m:sub>
+                            <m:r>
+                              <w:rPr>
+                                <w:rFonts w:ascii="Cambria Math" w:hAnsi="Cambria Math"/>
+                              </w:rPr>
+                              <m:t>c</m:t>
+                            </m:r>
+                          </m:sub>
+                        </m:sSub>
+                        <m:sSub>
+                          <m:sSubPr>
+                            <m:ctrlPr>
+                              <w:rPr>
+                                <w:rFonts w:ascii="Cambria Math" w:hAnsi="Cambria Math"/>
+                                <w:i/>
+                              </w:rPr>
+                            </m:ctrlPr>
+                          </m:sSubPr>
+                          <m:e>
+                            <m:r>
+                              <w:rPr>
+                                <w:rFonts w:ascii="Cambria Math" w:hAnsi="Cambria Math"/>
+                              </w:rPr>
+                              <m:t>A</m:t>
+                            </m:r>
+                          </m:e>
+                          <m:sub>
+                            <m:r>
+                              <w:rPr>
+                                <w:rFonts w:ascii="Cambria Math" w:hAnsi="Cambria Math"/>
+                              </w:rPr>
+                              <m:t>c</m:t>
+                            </m:r>
+                          </m:sub>
+                        </m:sSub>
+                        <m:r>
+                          <w:rPr>
+                            <w:rFonts w:ascii="Cambria Math" w:hAnsi="Cambria Math"/>
+                          </w:rPr>
+                          <m:t xml:space="preserve">+ </m:t>
+                        </m:r>
+                        <m:sSub>
+                          <m:sSubPr>
+                            <m:ctrlPr>
+                              <w:rPr>
+                                <w:rFonts w:ascii="Cambria Math" w:hAnsi="Cambria Math"/>
+                                <w:i/>
+                              </w:rPr>
+                            </m:ctrlPr>
+                          </m:sSubPr>
+                          <m:e>
+                            <m:r>
+                              <w:rPr>
+                                <w:rFonts w:ascii="Cambria Math" w:hAnsi="Cambria Math"/>
+                              </w:rPr>
+                              <m:t>E</m:t>
+                            </m:r>
+                          </m:e>
+                          <m:sub>
+                            <m:r>
+                              <w:rPr>
+                                <w:rFonts w:ascii="Cambria Math" w:hAnsi="Cambria Math"/>
+                              </w:rPr>
+                              <m:t>s</m:t>
+                            </m:r>
+                          </m:sub>
+                        </m:sSub>
+                        <m:sSub>
+                          <m:sSubPr>
+                            <m:ctrlPr>
+                              <w:rPr>
+                                <w:rFonts w:ascii="Cambria Math" w:hAnsi="Cambria Math"/>
+                                <w:i/>
+                              </w:rPr>
+                            </m:ctrlPr>
+                          </m:sSubPr>
+                          <m:e>
                             <m:sSub>
                               <m:sSubPr>
                                 <m:ctrlPr>
@@ -4208,7 +4954,7 @@
                                   <w:rPr>
                                     <w:rFonts w:ascii="Cambria Math" w:hAnsi="Cambria Math"/>
                                   </w:rPr>
-                                  <m:t>E</m:t>
+                                  <m:t>K</m:t>
                                 </m:r>
                               </m:e>
                               <m:sub>
@@ -4216,41 +4962,15 @@
                                   <w:rPr>
                                     <w:rFonts w:ascii="Cambria Math" w:hAnsi="Cambria Math"/>
                                   </w:rPr>
-                                  <m:t>c</m:t>
+                                  <m:t>db</m:t>
                                 </m:r>
                               </m:sub>
                             </m:sSub>
-                            <m:sSub>
-                              <m:sSubPr>
-                                <m:ctrlPr>
-                                  <w:rPr>
-                                    <w:rFonts w:ascii="Cambria Math" w:hAnsi="Cambria Math"/>
-                                    <w:i/>
-                                  </w:rPr>
-                                </m:ctrlPr>
-                              </m:sSubPr>
-                              <m:e>
-                                <m:r>
-                                  <w:rPr>
-                                    <w:rFonts w:ascii="Cambria Math" w:hAnsi="Cambria Math"/>
-                                  </w:rPr>
-                                  <m:t>A</m:t>
-                                </m:r>
-                              </m:e>
-                              <m:sub>
-                                <m:r>
-                                  <w:rPr>
-                                    <w:rFonts w:ascii="Cambria Math" w:hAnsi="Cambria Math"/>
-                                  </w:rPr>
-                                  <m:t>c</m:t>
-                                </m:r>
-                              </m:sub>
-                            </m:sSub>
-                            <m:r>
-                              <w:rPr>
-                                <w:rFonts w:ascii="Cambria Math" w:hAnsi="Cambria Math"/>
-                              </w:rPr>
-                              <m:t>+E</m:t>
+                            <m:r>
+                              <w:rPr>
+                                <w:rFonts w:ascii="Cambria Math" w:hAnsi="Cambria Math"/>
+                              </w:rPr>
+                              <m:t>A</m:t>
                             </m:r>
                           </m:e>
                           <m:sub>
@@ -4262,32 +4982,6 @@
                             </m:r>
                           </m:sub>
                         </m:sSub>
-                        <m:sSub>
-                          <m:sSubPr>
-                            <m:ctrlPr>
-                              <w:rPr>
-                                <w:rFonts w:ascii="Cambria Math" w:hAnsi="Cambria Math"/>
-                                <w:i/>
-                              </w:rPr>
-                            </m:ctrlPr>
-                          </m:sSubPr>
-                          <m:e>
-                            <m:r>
-                              <w:rPr>
-                                <w:rFonts w:ascii="Cambria Math" w:hAnsi="Cambria Math"/>
-                              </w:rPr>
-                              <m:t>A</m:t>
-                            </m:r>
-                          </m:e>
-                          <m:sub>
-                            <m:r>
-                              <w:rPr>
-                                <w:rFonts w:ascii="Cambria Math" w:hAnsi="Cambria Math"/>
-                              </w:rPr>
-                              <m:t>s</m:t>
-                            </m:r>
-                          </m:sub>
-                        </m:sSub>
                         <m:r>
                           <w:rPr>
                             <w:rFonts w:ascii="Cambria Math" w:hAnsi="Cambria Math"/>
@@ -4317,6 +5011,32 @@
                                 <w:rFonts w:ascii="Cambria Math" w:hAnsi="Cambria Math"/>
                               </w:rPr>
                               <m:t>p</m:t>
+                            </m:r>
+                          </m:sub>
+                        </m:sSub>
+                        <m:sSub>
+                          <m:sSubPr>
+                            <m:ctrlPr>
+                              <w:rPr>
+                                <w:rFonts w:ascii="Cambria Math" w:hAnsi="Cambria Math"/>
+                                <w:i/>
+                              </w:rPr>
+                            </m:ctrlPr>
+                          </m:sSubPr>
+                          <m:e>
+                            <m:r>
+                              <w:rPr>
+                                <w:rFonts w:ascii="Cambria Math" w:hAnsi="Cambria Math"/>
+                              </w:rPr>
+                              <m:t>K</m:t>
+                            </m:r>
+                          </m:e>
+                          <m:sub>
+                            <m:r>
+                              <w:rPr>
+                                <w:rFonts w:ascii="Cambria Math" w:hAnsi="Cambria Math"/>
+                              </w:rPr>
+                              <m:t>ds</m:t>
                             </m:r>
                           </m:sub>
                         </m:sSub>
@@ -4675,6 +5395,32 @@
                             </m:ctrlPr>
                           </m:sSubPr>
                           <m:e>
+                            <m:sSub>
+                              <m:sSubPr>
+                                <m:ctrlPr>
+                                  <w:rPr>
+                                    <w:rFonts w:ascii="Cambria Math" w:hAnsi="Cambria Math"/>
+                                    <w:i/>
+                                  </w:rPr>
+                                </m:ctrlPr>
+                              </m:sSubPr>
+                              <m:e>
+                                <m:r>
+                                  <w:rPr>
+                                    <w:rFonts w:ascii="Cambria Math" w:hAnsi="Cambria Math"/>
+                                  </w:rPr>
+                                  <m:t>K</m:t>
+                                </m:r>
+                              </m:e>
+                              <m:sub>
+                                <m:r>
+                                  <w:rPr>
+                                    <w:rFonts w:ascii="Cambria Math" w:hAnsi="Cambria Math"/>
+                                  </w:rPr>
+                                  <m:t>dt</m:t>
+                                </m:r>
+                              </m:sub>
+                            </m:sSub>
                             <m:r>
                               <w:rPr>
                                 <w:rFonts w:ascii="Cambria Math" w:hAnsi="Cambria Math"/>
@@ -4731,6 +5477,32 @@
                         </m:ctrlPr>
                       </m:sSubPr>
                       <m:e>
+                        <m:sSub>
+                          <m:sSubPr>
+                            <m:ctrlPr>
+                              <w:rPr>
+                                <w:rFonts w:ascii="Cambria Math" w:hAnsi="Cambria Math"/>
+                                <w:i/>
+                              </w:rPr>
+                            </m:ctrlPr>
+                          </m:sSubPr>
+                          <m:e>
+                            <m:r>
+                              <w:rPr>
+                                <w:rFonts w:ascii="Cambria Math" w:hAnsi="Cambria Math"/>
+                              </w:rPr>
+                              <m:t>K</m:t>
+                            </m:r>
+                          </m:e>
+                          <m:sub>
+                            <m:r>
+                              <w:rPr>
+                                <w:rFonts w:ascii="Cambria Math" w:hAnsi="Cambria Math"/>
+                              </w:rPr>
+                              <m:t>db</m:t>
+                            </m:r>
+                          </m:sub>
+                        </m:sSub>
                         <m:r>
                           <w:rPr>
                             <w:rFonts w:ascii="Cambria Math" w:hAnsi="Cambria Math"/>
@@ -4776,6 +5548,32 @@
                             <w:rFonts w:ascii="Cambria Math" w:hAnsi="Cambria Math"/>
                           </w:rPr>
                           <m:t>p</m:t>
+                        </m:r>
+                      </m:sub>
+                    </m:sSub>
+                    <m:sSub>
+                      <m:sSubPr>
+                        <m:ctrlPr>
+                          <w:rPr>
+                            <w:rFonts w:ascii="Cambria Math" w:hAnsi="Cambria Math"/>
+                            <w:i/>
+                          </w:rPr>
+                        </m:ctrlPr>
+                      </m:sSubPr>
+                      <m:e>
+                        <m:r>
+                          <w:rPr>
+                            <w:rFonts w:ascii="Cambria Math" w:hAnsi="Cambria Math"/>
+                          </w:rPr>
+                          <m:t>K</m:t>
+                        </m:r>
+                      </m:e>
+                      <m:sub>
+                        <m:r>
+                          <w:rPr>
+                            <w:rFonts w:ascii="Cambria Math" w:hAnsi="Cambria Math"/>
+                          </w:rPr>
+                          <m:t>ds</m:t>
                         </m:r>
                       </m:sub>
                     </m:sSub>
@@ -5137,6 +5935,32 @@
                               <w:rPr>
                                 <w:rFonts w:ascii="Cambria Math" w:hAnsi="Cambria Math"/>
                               </w:rPr>
+                              <m:t>K</m:t>
+                            </m:r>
+                          </m:e>
+                          <m:sub>
+                            <m:r>
+                              <w:rPr>
+                                <w:rFonts w:ascii="Cambria Math" w:hAnsi="Cambria Math"/>
+                              </w:rPr>
+                              <m:t>dt</m:t>
+                            </m:r>
+                          </m:sub>
+                        </m:sSub>
+                        <m:sSub>
+                          <m:sSubPr>
+                            <m:ctrlPr>
+                              <w:rPr>
+                                <w:rFonts w:ascii="Cambria Math" w:hAnsi="Cambria Math"/>
+                                <w:i/>
+                              </w:rPr>
+                            </m:ctrlPr>
+                          </m:sSubPr>
+                          <m:e>
+                            <m:r>
+                              <w:rPr>
+                                <w:rFonts w:ascii="Cambria Math" w:hAnsi="Cambria Math"/>
+                              </w:rPr>
                               <m:t>f</m:t>
                             </m:r>
                           </m:e>
@@ -5189,6 +6013,32 @@
                         </m:ctrlPr>
                       </m:sSubPr>
                       <m:e>
+                        <m:sSub>
+                          <m:sSubPr>
+                            <m:ctrlPr>
+                              <w:rPr>
+                                <w:rFonts w:ascii="Cambria Math" w:hAnsi="Cambria Math"/>
+                                <w:i/>
+                              </w:rPr>
+                            </m:ctrlPr>
+                          </m:sSubPr>
+                          <m:e>
+                            <m:r>
+                              <w:rPr>
+                                <w:rFonts w:ascii="Cambria Math" w:hAnsi="Cambria Math"/>
+                              </w:rPr>
+                              <m:t>K</m:t>
+                            </m:r>
+                          </m:e>
+                          <m:sub>
+                            <m:r>
+                              <w:rPr>
+                                <w:rFonts w:ascii="Cambria Math" w:hAnsi="Cambria Math"/>
+                              </w:rPr>
+                              <m:t>db</m:t>
+                            </m:r>
+                          </m:sub>
+                        </m:sSub>
                         <m:r>
                           <w:rPr>
                             <w:rFonts w:ascii="Cambria Math" w:hAnsi="Cambria Math"/>
@@ -5251,6 +6101,32 @@
                           <w:rPr>
                             <w:rFonts w:ascii="Cambria Math" w:hAnsi="Cambria Math"/>
                           </w:rPr>
+                          <m:t>K</m:t>
+                        </m:r>
+                      </m:e>
+                      <m:sub>
+                        <m:r>
+                          <w:rPr>
+                            <w:rFonts w:ascii="Cambria Math" w:hAnsi="Cambria Math"/>
+                          </w:rPr>
+                          <m:t>ds</m:t>
+                        </m:r>
+                      </m:sub>
+                    </m:sSub>
+                    <m:sSub>
+                      <m:sSubPr>
+                        <m:ctrlPr>
+                          <w:rPr>
+                            <w:rFonts w:ascii="Cambria Math" w:hAnsi="Cambria Math"/>
+                            <w:i/>
+                          </w:rPr>
+                        </m:ctrlPr>
+                      </m:sSubPr>
+                      <m:e>
+                        <m:r>
+                          <w:rPr>
+                            <w:rFonts w:ascii="Cambria Math" w:hAnsi="Cambria Math"/>
+                          </w:rPr>
                           <m:t>A</m:t>
                         </m:r>
                       </m:e>
@@ -5317,13 +6193,7 @@
                           <w:rPr>
                             <w:rFonts w:ascii="Cambria Math" w:hAnsi="Cambria Math"/>
                           </w:rPr>
-                          <m:t>c</m:t>
-                        </m:r>
-                        <m:r>
-                          <w:rPr>
-                            <w:rFonts w:ascii="Cambria Math" w:hAnsi="Cambria Math"/>
-                          </w:rPr>
-                          <m:t>t</m:t>
+                          <m:t>ct</m:t>
                         </m:r>
                       </m:sub>
                     </m:sSub>
@@ -5699,6 +6569,32 @@
                             </m:ctrlPr>
                           </m:sSubPr>
                           <m:e>
+                            <m:sSub>
+                              <m:sSubPr>
+                                <m:ctrlPr>
+                                  <w:rPr>
+                                    <w:rFonts w:ascii="Cambria Math" w:hAnsi="Cambria Math"/>
+                                    <w:i/>
+                                  </w:rPr>
+                                </m:ctrlPr>
+                              </m:sSubPr>
+                              <m:e>
+                                <m:r>
+                                  <w:rPr>
+                                    <w:rFonts w:ascii="Cambria Math" w:hAnsi="Cambria Math"/>
+                                  </w:rPr>
+                                  <m:t>K</m:t>
+                                </m:r>
+                              </m:e>
+                              <m:sub>
+                                <m:r>
+                                  <w:rPr>
+                                    <w:rFonts w:ascii="Cambria Math" w:hAnsi="Cambria Math"/>
+                                  </w:rPr>
+                                  <m:t>dt</m:t>
+                                </m:r>
+                              </m:sub>
+                            </m:sSub>
                             <m:r>
                               <w:rPr>
                                 <w:rFonts w:ascii="Cambria Math" w:hAnsi="Cambria Math"/>
@@ -5771,6 +6667,32 @@
                             </m:ctrlPr>
                           </m:sSubPr>
                           <m:e>
+                            <m:sSub>
+                              <m:sSubPr>
+                                <m:ctrlPr>
+                                  <w:rPr>
+                                    <w:rFonts w:ascii="Cambria Math" w:hAnsi="Cambria Math"/>
+                                    <w:i/>
+                                  </w:rPr>
+                                </m:ctrlPr>
+                              </m:sSubPr>
+                              <m:e>
+                                <m:r>
+                                  <w:rPr>
+                                    <w:rFonts w:ascii="Cambria Math" w:hAnsi="Cambria Math"/>
+                                  </w:rPr>
+                                  <m:t>K</m:t>
+                                </m:r>
+                              </m:e>
+                              <m:sub>
+                                <m:r>
+                                  <w:rPr>
+                                    <w:rFonts w:ascii="Cambria Math" w:hAnsi="Cambria Math"/>
+                                  </w:rPr>
+                                  <m:t>db</m:t>
+                                </m:r>
+                              </m:sub>
+                            </m:sSub>
                             <m:r>
                               <w:rPr>
                                 <w:rFonts w:ascii="Cambria Math" w:hAnsi="Cambria Math"/>
@@ -5816,6 +6738,32 @@
                                 <w:rFonts w:ascii="Cambria Math" w:hAnsi="Cambria Math"/>
                               </w:rPr>
                               <m:t>p</m:t>
+                            </m:r>
+                          </m:sub>
+                        </m:sSub>
+                        <m:sSub>
+                          <m:sSubPr>
+                            <m:ctrlPr>
+                              <w:rPr>
+                                <w:rFonts w:ascii="Cambria Math" w:hAnsi="Cambria Math"/>
+                                <w:i/>
+                              </w:rPr>
+                            </m:ctrlPr>
+                          </m:sSubPr>
+                          <m:e>
+                            <m:r>
+                              <w:rPr>
+                                <w:rFonts w:ascii="Cambria Math" w:hAnsi="Cambria Math"/>
+                              </w:rPr>
+                              <m:t>K</m:t>
+                            </m:r>
+                          </m:e>
+                          <m:sub>
+                            <m:r>
+                              <w:rPr>
+                                <w:rFonts w:ascii="Cambria Math" w:hAnsi="Cambria Math"/>
+                              </w:rPr>
+                              <m:t>ds</m:t>
                             </m:r>
                           </m:sub>
                         </m:sSub>
@@ -6166,6 +7114,32 @@
                             </m:ctrlPr>
                           </m:sSubPr>
                           <m:e>
+                            <m:sSub>
+                              <m:sSubPr>
+                                <m:ctrlPr>
+                                  <w:rPr>
+                                    <w:rFonts w:ascii="Cambria Math" w:hAnsi="Cambria Math"/>
+                                    <w:i/>
+                                  </w:rPr>
+                                </m:ctrlPr>
+                              </m:sSubPr>
+                              <m:e>
+                                <m:r>
+                                  <w:rPr>
+                                    <w:rFonts w:ascii="Cambria Math" w:hAnsi="Cambria Math"/>
+                                  </w:rPr>
+                                  <m:t>K</m:t>
+                                </m:r>
+                              </m:e>
+                              <m:sub>
+                                <m:r>
+                                  <w:rPr>
+                                    <w:rFonts w:ascii="Cambria Math" w:hAnsi="Cambria Math"/>
+                                  </w:rPr>
+                                  <m:t>dt</m:t>
+                                </m:r>
+                              </m:sub>
+                            </m:sSub>
                             <m:r>
                               <w:rPr>
                                 <w:rFonts w:ascii="Cambria Math" w:hAnsi="Cambria Math"/>
@@ -6222,6 +7196,32 @@
                         </m:ctrlPr>
                       </m:sSubPr>
                       <m:e>
+                        <m:sSub>
+                          <m:sSubPr>
+                            <m:ctrlPr>
+                              <w:rPr>
+                                <w:rFonts w:ascii="Cambria Math" w:hAnsi="Cambria Math"/>
+                                <w:i/>
+                              </w:rPr>
+                            </m:ctrlPr>
+                          </m:sSubPr>
+                          <m:e>
+                            <m:r>
+                              <w:rPr>
+                                <w:rFonts w:ascii="Cambria Math" w:hAnsi="Cambria Math"/>
+                              </w:rPr>
+                              <m:t>K</m:t>
+                            </m:r>
+                          </m:e>
+                          <m:sub>
+                            <m:r>
+                              <w:rPr>
+                                <w:rFonts w:ascii="Cambria Math" w:hAnsi="Cambria Math"/>
+                              </w:rPr>
+                              <m:t>db</m:t>
+                            </m:r>
+                          </m:sub>
+                        </m:sSub>
                         <m:r>
                           <w:rPr>
                             <w:rFonts w:ascii="Cambria Math" w:hAnsi="Cambria Math"/>
@@ -6267,6 +7267,32 @@
                             <w:rFonts w:ascii="Cambria Math" w:hAnsi="Cambria Math"/>
                           </w:rPr>
                           <m:t>p</m:t>
+                        </m:r>
+                      </m:sub>
+                    </m:sSub>
+                    <m:sSub>
+                      <m:sSubPr>
+                        <m:ctrlPr>
+                          <w:rPr>
+                            <w:rFonts w:ascii="Cambria Math" w:hAnsi="Cambria Math"/>
+                            <w:i/>
+                          </w:rPr>
+                        </m:ctrlPr>
+                      </m:sSubPr>
+                      <m:e>
+                        <m:r>
+                          <w:rPr>
+                            <w:rFonts w:ascii="Cambria Math" w:hAnsi="Cambria Math"/>
+                          </w:rPr>
+                          <m:t>K</m:t>
+                        </m:r>
+                      </m:e>
+                      <m:sub>
+                        <m:r>
+                          <w:rPr>
+                            <w:rFonts w:ascii="Cambria Math" w:hAnsi="Cambria Math"/>
+                          </w:rPr>
+                          <m:t>ds</m:t>
                         </m:r>
                       </m:sub>
                     </m:sSub>
@@ -6615,6 +7641,32 @@
                             </m:ctrlPr>
                           </m:sSubPr>
                           <m:e>
+                            <m:sSub>
+                              <m:sSubPr>
+                                <m:ctrlPr>
+                                  <w:rPr>
+                                    <w:rFonts w:ascii="Cambria Math" w:hAnsi="Cambria Math"/>
+                                    <w:i/>
+                                  </w:rPr>
+                                </m:ctrlPr>
+                              </m:sSubPr>
+                              <m:e>
+                                <m:r>
+                                  <w:rPr>
+                                    <w:rFonts w:ascii="Cambria Math" w:hAnsi="Cambria Math"/>
+                                  </w:rPr>
+                                  <m:t>K</m:t>
+                                </m:r>
+                              </m:e>
+                              <m:sub>
+                                <m:r>
+                                  <w:rPr>
+                                    <w:rFonts w:ascii="Cambria Math" w:hAnsi="Cambria Math"/>
+                                  </w:rPr>
+                                  <m:t>dt</m:t>
+                                </m:r>
+                              </m:sub>
+                            </m:sSub>
                             <m:r>
                               <w:rPr>
                                 <w:rFonts w:ascii="Cambria Math" w:hAnsi="Cambria Math"/>
@@ -6661,6 +7713,90 @@
                             </m:ctrlPr>
                           </m:sSubPr>
                           <m:e>
+                            <m:r>
+                              <w:rPr>
+                                <w:rFonts w:ascii="Cambria Math" w:hAnsi="Cambria Math"/>
+                              </w:rPr>
+                              <m:t>E</m:t>
+                            </m:r>
+                          </m:e>
+                          <m:sub>
+                            <m:r>
+                              <w:rPr>
+                                <w:rFonts w:ascii="Cambria Math" w:hAnsi="Cambria Math"/>
+                              </w:rPr>
+                              <m:t>c</m:t>
+                            </m:r>
+                          </m:sub>
+                        </m:sSub>
+                        <m:sSub>
+                          <m:sSubPr>
+                            <m:ctrlPr>
+                              <w:rPr>
+                                <w:rFonts w:ascii="Cambria Math" w:hAnsi="Cambria Math"/>
+                                <w:i/>
+                              </w:rPr>
+                            </m:ctrlPr>
+                          </m:sSubPr>
+                          <m:e>
+                            <m:r>
+                              <w:rPr>
+                                <w:rFonts w:ascii="Cambria Math" w:hAnsi="Cambria Math"/>
+                              </w:rPr>
+                              <m:t>A</m:t>
+                            </m:r>
+                          </m:e>
+                          <m:sub>
+                            <m:r>
+                              <w:rPr>
+                                <w:rFonts w:ascii="Cambria Math" w:hAnsi="Cambria Math"/>
+                              </w:rPr>
+                              <m:t>c</m:t>
+                            </m:r>
+                          </m:sub>
+                        </m:sSub>
+                        <m:r>
+                          <w:rPr>
+                            <w:rFonts w:ascii="Cambria Math" w:hAnsi="Cambria Math"/>
+                          </w:rPr>
+                          <m:t xml:space="preserve">+ </m:t>
+                        </m:r>
+                        <m:sSub>
+                          <m:sSubPr>
+                            <m:ctrlPr>
+                              <w:rPr>
+                                <w:rFonts w:ascii="Cambria Math" w:hAnsi="Cambria Math"/>
+                                <w:i/>
+                              </w:rPr>
+                            </m:ctrlPr>
+                          </m:sSubPr>
+                          <m:e>
+                            <m:r>
+                              <w:rPr>
+                                <w:rFonts w:ascii="Cambria Math" w:hAnsi="Cambria Math"/>
+                              </w:rPr>
+                              <m:t>E</m:t>
+                            </m:r>
+                          </m:e>
+                          <m:sub>
+                            <m:r>
+                              <w:rPr>
+                                <w:rFonts w:ascii="Cambria Math" w:hAnsi="Cambria Math"/>
+                              </w:rPr>
+                              <m:t>s</m:t>
+                            </m:r>
+                          </m:sub>
+                        </m:sSub>
+                        <m:sSub>
+                          <m:sSubPr>
+                            <m:ctrlPr>
+                              <w:rPr>
+                                <w:rFonts w:ascii="Cambria Math" w:hAnsi="Cambria Math"/>
+                                <w:i/>
+                              </w:rPr>
+                            </m:ctrlPr>
+                          </m:sSubPr>
+                          <m:e>
                             <m:sSub>
                               <m:sSubPr>
                                 <m:ctrlPr>
@@ -6675,7 +7811,7 @@
                                   <w:rPr>
                                     <w:rFonts w:ascii="Cambria Math" w:hAnsi="Cambria Math"/>
                                   </w:rPr>
-                                  <m:t>E</m:t>
+                                  <m:t>K</m:t>
                                 </m:r>
                               </m:e>
                               <m:sub>
@@ -6683,41 +7819,15 @@
                                   <w:rPr>
                                     <w:rFonts w:ascii="Cambria Math" w:hAnsi="Cambria Math"/>
                                   </w:rPr>
-                                  <m:t>c</m:t>
+                                  <m:t>db</m:t>
                                 </m:r>
                               </m:sub>
                             </m:sSub>
-                            <m:sSub>
-                              <m:sSubPr>
-                                <m:ctrlPr>
-                                  <w:rPr>
-                                    <w:rFonts w:ascii="Cambria Math" w:hAnsi="Cambria Math"/>
-                                    <w:i/>
-                                  </w:rPr>
-                                </m:ctrlPr>
-                              </m:sSubPr>
-                              <m:e>
-                                <m:r>
-                                  <w:rPr>
-                                    <w:rFonts w:ascii="Cambria Math" w:hAnsi="Cambria Math"/>
-                                  </w:rPr>
-                                  <m:t>A</m:t>
-                                </m:r>
-                              </m:e>
-                              <m:sub>
-                                <m:r>
-                                  <w:rPr>
-                                    <w:rFonts w:ascii="Cambria Math" w:hAnsi="Cambria Math"/>
-                                  </w:rPr>
-                                  <m:t>c</m:t>
-                                </m:r>
-                              </m:sub>
-                            </m:sSub>
-                            <m:r>
-                              <w:rPr>
-                                <w:rFonts w:ascii="Cambria Math" w:hAnsi="Cambria Math"/>
-                              </w:rPr>
-                              <m:t>+E</m:t>
+                            <m:r>
+                              <w:rPr>
+                                <w:rFonts w:ascii="Cambria Math" w:hAnsi="Cambria Math"/>
+                              </w:rPr>
+                              <m:t>A</m:t>
                             </m:r>
                           </m:e>
                           <m:sub>
@@ -6729,32 +7839,6 @@
                             </m:r>
                           </m:sub>
                         </m:sSub>
-                        <m:sSub>
-                          <m:sSubPr>
-                            <m:ctrlPr>
-                              <w:rPr>
-                                <w:rFonts w:ascii="Cambria Math" w:hAnsi="Cambria Math"/>
-                                <w:i/>
-                              </w:rPr>
-                            </m:ctrlPr>
-                          </m:sSubPr>
-                          <m:e>
-                            <m:r>
-                              <w:rPr>
-                                <w:rFonts w:ascii="Cambria Math" w:hAnsi="Cambria Math"/>
-                              </w:rPr>
-                              <m:t>A</m:t>
-                            </m:r>
-                          </m:e>
-                          <m:sub>
-                            <m:r>
-                              <w:rPr>
-                                <w:rFonts w:ascii="Cambria Math" w:hAnsi="Cambria Math"/>
-                              </w:rPr>
-                              <m:t>s</m:t>
-                            </m:r>
-                          </m:sub>
-                        </m:sSub>
                         <m:r>
                           <w:rPr>
                             <w:rFonts w:ascii="Cambria Math" w:hAnsi="Cambria Math"/>
@@ -6784,6 +7868,32 @@
                                 <w:rFonts w:ascii="Cambria Math" w:hAnsi="Cambria Math"/>
                               </w:rPr>
                               <m:t>p</m:t>
+                            </m:r>
+                          </m:sub>
+                        </m:sSub>
+                        <m:sSub>
+                          <m:sSubPr>
+                            <m:ctrlPr>
+                              <w:rPr>
+                                <w:rFonts w:ascii="Cambria Math" w:hAnsi="Cambria Math"/>
+                                <w:i/>
+                              </w:rPr>
+                            </m:ctrlPr>
+                          </m:sSubPr>
+                          <m:e>
+                            <m:r>
+                              <w:rPr>
+                                <w:rFonts w:ascii="Cambria Math" w:hAnsi="Cambria Math"/>
+                              </w:rPr>
+                              <m:t>K</m:t>
+                            </m:r>
+                          </m:e>
+                          <m:sub>
+                            <m:r>
+                              <w:rPr>
+                                <w:rFonts w:ascii="Cambria Math" w:hAnsi="Cambria Math"/>
+                              </w:rPr>
+                              <m:t>ds</m:t>
                             </m:r>
                           </m:sub>
                         </m:sSub>
@@ -7157,6 +8267,32 @@
                             </m:ctrlPr>
                           </m:sSubPr>
                           <m:e>
+                            <m:sSub>
+                              <m:sSubPr>
+                                <m:ctrlPr>
+                                  <w:rPr>
+                                    <w:rFonts w:ascii="Cambria Math" w:hAnsi="Cambria Math"/>
+                                    <w:i/>
+                                  </w:rPr>
+                                </m:ctrlPr>
+                              </m:sSubPr>
+                              <m:e>
+                                <m:r>
+                                  <w:rPr>
+                                    <w:rFonts w:ascii="Cambria Math" w:hAnsi="Cambria Math"/>
+                                  </w:rPr>
+                                  <m:t>K</m:t>
+                                </m:r>
+                              </m:e>
+                              <m:sub>
+                                <m:r>
+                                  <w:rPr>
+                                    <w:rFonts w:ascii="Cambria Math" w:hAnsi="Cambria Math"/>
+                                  </w:rPr>
+                                  <m:t>dt</m:t>
+                                </m:r>
+                              </m:sub>
+                            </m:sSub>
                             <m:r>
                               <w:rPr>
                                 <w:rFonts w:ascii="Cambria Math" w:hAnsi="Cambria Math"/>
@@ -7229,6 +8365,32 @@
                             </m:ctrlPr>
                           </m:sSubPr>
                           <m:e>
+                            <m:sSub>
+                              <m:sSubPr>
+                                <m:ctrlPr>
+                                  <w:rPr>
+                                    <w:rFonts w:ascii="Cambria Math" w:hAnsi="Cambria Math"/>
+                                    <w:i/>
+                                  </w:rPr>
+                                </m:ctrlPr>
+                              </m:sSubPr>
+                              <m:e>
+                                <m:r>
+                                  <w:rPr>
+                                    <w:rFonts w:ascii="Cambria Math" w:hAnsi="Cambria Math"/>
+                                  </w:rPr>
+                                  <m:t>K</m:t>
+                                </m:r>
+                              </m:e>
+                              <m:sub>
+                                <m:r>
+                                  <w:rPr>
+                                    <w:rFonts w:ascii="Cambria Math" w:hAnsi="Cambria Math"/>
+                                  </w:rPr>
+                                  <m:t>db</m:t>
+                                </m:r>
+                              </m:sub>
+                            </m:sSub>
                             <m:r>
                               <w:rPr>
                                 <w:rFonts w:ascii="Cambria Math" w:hAnsi="Cambria Math"/>
@@ -7274,6 +8436,32 @@
                                 <w:rFonts w:ascii="Cambria Math" w:hAnsi="Cambria Math"/>
                               </w:rPr>
                               <m:t>p</m:t>
+                            </m:r>
+                          </m:sub>
+                        </m:sSub>
+                        <m:sSub>
+                          <m:sSubPr>
+                            <m:ctrlPr>
+                              <w:rPr>
+                                <w:rFonts w:ascii="Cambria Math" w:hAnsi="Cambria Math"/>
+                                <w:i/>
+                              </w:rPr>
+                            </m:ctrlPr>
+                          </m:sSubPr>
+                          <m:e>
+                            <m:r>
+                              <w:rPr>
+                                <w:rFonts w:ascii="Cambria Math" w:hAnsi="Cambria Math"/>
+                              </w:rPr>
+                              <m:t>K</m:t>
+                            </m:r>
+                          </m:e>
+                          <m:sub>
+                            <m:r>
+                              <w:rPr>
+                                <w:rFonts w:ascii="Cambria Math" w:hAnsi="Cambria Math"/>
+                              </w:rPr>
+                              <m:t>ds</m:t>
                             </m:r>
                           </m:sub>
                         </m:sSub>
@@ -7624,6 +8812,32 @@
                             </m:ctrlPr>
                           </m:sSubPr>
                           <m:e>
+                            <m:sSub>
+                              <m:sSubPr>
+                                <m:ctrlPr>
+                                  <w:rPr>
+                                    <w:rFonts w:ascii="Cambria Math" w:hAnsi="Cambria Math"/>
+                                    <w:i/>
+                                  </w:rPr>
+                                </m:ctrlPr>
+                              </m:sSubPr>
+                              <m:e>
+                                <m:r>
+                                  <w:rPr>
+                                    <w:rFonts w:ascii="Cambria Math" w:hAnsi="Cambria Math"/>
+                                  </w:rPr>
+                                  <m:t>K</m:t>
+                                </m:r>
+                              </m:e>
+                              <m:sub>
+                                <m:r>
+                                  <w:rPr>
+                                    <w:rFonts w:ascii="Cambria Math" w:hAnsi="Cambria Math"/>
+                                  </w:rPr>
+                                  <m:t>dt</m:t>
+                                </m:r>
+                              </m:sub>
+                            </m:sSub>
                             <m:r>
                               <w:rPr>
                                 <w:rFonts w:ascii="Cambria Math" w:hAnsi="Cambria Math"/>
@@ -7680,6 +8894,32 @@
                         </m:ctrlPr>
                       </m:sSubPr>
                       <m:e>
+                        <m:sSub>
+                          <m:sSubPr>
+                            <m:ctrlPr>
+                              <w:rPr>
+                                <w:rFonts w:ascii="Cambria Math" w:hAnsi="Cambria Math"/>
+                                <w:i/>
+                              </w:rPr>
+                            </m:ctrlPr>
+                          </m:sSubPr>
+                          <m:e>
+                            <m:r>
+                              <w:rPr>
+                                <w:rFonts w:ascii="Cambria Math" w:hAnsi="Cambria Math"/>
+                              </w:rPr>
+                              <m:t>K</m:t>
+                            </m:r>
+                          </m:e>
+                          <m:sub>
+                            <m:r>
+                              <w:rPr>
+                                <w:rFonts w:ascii="Cambria Math" w:hAnsi="Cambria Math"/>
+                              </w:rPr>
+                              <m:t>db</m:t>
+                            </m:r>
+                          </m:sub>
+                        </m:sSub>
                         <m:r>
                           <w:rPr>
                             <w:rFonts w:ascii="Cambria Math" w:hAnsi="Cambria Math"/>
@@ -7725,6 +8965,32 @@
                             <w:rFonts w:ascii="Cambria Math" w:hAnsi="Cambria Math"/>
                           </w:rPr>
                           <m:t>p</m:t>
+                        </m:r>
+                      </m:sub>
+                    </m:sSub>
+                    <m:sSub>
+                      <m:sSubPr>
+                        <m:ctrlPr>
+                          <w:rPr>
+                            <w:rFonts w:ascii="Cambria Math" w:hAnsi="Cambria Math"/>
+                            <w:i/>
+                          </w:rPr>
+                        </m:ctrlPr>
+                      </m:sSubPr>
+                      <m:e>
+                        <m:r>
+                          <w:rPr>
+                            <w:rFonts w:ascii="Cambria Math" w:hAnsi="Cambria Math"/>
+                          </w:rPr>
+                          <m:t>K</m:t>
+                        </m:r>
+                      </m:e>
+                      <m:sub>
+                        <m:r>
+                          <w:rPr>
+                            <w:rFonts w:ascii="Cambria Math" w:hAnsi="Cambria Math"/>
+                          </w:rPr>
+                          <m:t>ds</m:t>
                         </m:r>
                       </m:sub>
                     </m:sSub>
@@ -8073,6 +9339,32 @@
                             </m:ctrlPr>
                           </m:sSubPr>
                           <m:e>
+                            <m:sSub>
+                              <m:sSubPr>
+                                <m:ctrlPr>
+                                  <w:rPr>
+                                    <w:rFonts w:ascii="Cambria Math" w:hAnsi="Cambria Math"/>
+                                    <w:i/>
+                                  </w:rPr>
+                                </m:ctrlPr>
+                              </m:sSubPr>
+                              <m:e>
+                                <m:r>
+                                  <w:rPr>
+                                    <w:rFonts w:ascii="Cambria Math" w:hAnsi="Cambria Math"/>
+                                  </w:rPr>
+                                  <m:t>K</m:t>
+                                </m:r>
+                              </m:e>
+                              <m:sub>
+                                <m:r>
+                                  <w:rPr>
+                                    <w:rFonts w:ascii="Cambria Math" w:hAnsi="Cambria Math"/>
+                                  </w:rPr>
+                                  <m:t>dt</m:t>
+                                </m:r>
+                              </m:sub>
+                            </m:sSub>
                             <m:r>
                               <w:rPr>
                                 <w:rFonts w:ascii="Cambria Math" w:hAnsi="Cambria Math"/>
@@ -8119,6 +9411,90 @@
                             </m:ctrlPr>
                           </m:sSubPr>
                           <m:e>
+                            <m:r>
+                              <w:rPr>
+                                <w:rFonts w:ascii="Cambria Math" w:hAnsi="Cambria Math"/>
+                              </w:rPr>
+                              <m:t>E</m:t>
+                            </m:r>
+                          </m:e>
+                          <m:sub>
+                            <m:r>
+                              <w:rPr>
+                                <w:rFonts w:ascii="Cambria Math" w:hAnsi="Cambria Math"/>
+                              </w:rPr>
+                              <m:t>c</m:t>
+                            </m:r>
+                          </m:sub>
+                        </m:sSub>
+                        <m:sSub>
+                          <m:sSubPr>
+                            <m:ctrlPr>
+                              <w:rPr>
+                                <w:rFonts w:ascii="Cambria Math" w:hAnsi="Cambria Math"/>
+                                <w:i/>
+                              </w:rPr>
+                            </m:ctrlPr>
+                          </m:sSubPr>
+                          <m:e>
+                            <m:r>
+                              <w:rPr>
+                                <w:rFonts w:ascii="Cambria Math" w:hAnsi="Cambria Math"/>
+                              </w:rPr>
+                              <m:t>A</m:t>
+                            </m:r>
+                          </m:e>
+                          <m:sub>
+                            <m:r>
+                              <w:rPr>
+                                <w:rFonts w:ascii="Cambria Math" w:hAnsi="Cambria Math"/>
+                              </w:rPr>
+                              <m:t>c</m:t>
+                            </m:r>
+                          </m:sub>
+                        </m:sSub>
+                        <m:r>
+                          <w:rPr>
+                            <w:rFonts w:ascii="Cambria Math" w:hAnsi="Cambria Math"/>
+                          </w:rPr>
+                          <m:t xml:space="preserve">+ </m:t>
+                        </m:r>
+                        <m:sSub>
+                          <m:sSubPr>
+                            <m:ctrlPr>
+                              <w:rPr>
+                                <w:rFonts w:ascii="Cambria Math" w:hAnsi="Cambria Math"/>
+                                <w:i/>
+                              </w:rPr>
+                            </m:ctrlPr>
+                          </m:sSubPr>
+                          <m:e>
+                            <m:r>
+                              <w:rPr>
+                                <w:rFonts w:ascii="Cambria Math" w:hAnsi="Cambria Math"/>
+                              </w:rPr>
+                              <m:t>E</m:t>
+                            </m:r>
+                          </m:e>
+                          <m:sub>
+                            <m:r>
+                              <w:rPr>
+                                <w:rFonts w:ascii="Cambria Math" w:hAnsi="Cambria Math"/>
+                              </w:rPr>
+                              <m:t>s</m:t>
+                            </m:r>
+                          </m:sub>
+                        </m:sSub>
+                        <m:sSub>
+                          <m:sSubPr>
+                            <m:ctrlPr>
+                              <w:rPr>
+                                <w:rFonts w:ascii="Cambria Math" w:hAnsi="Cambria Math"/>
+                                <w:i/>
+                              </w:rPr>
+                            </m:ctrlPr>
+                          </m:sSubPr>
+                          <m:e>
                             <m:sSub>
                               <m:sSubPr>
                                 <m:ctrlPr>
@@ -8133,7 +9509,7 @@
                                   <w:rPr>
                                     <w:rFonts w:ascii="Cambria Math" w:hAnsi="Cambria Math"/>
                                   </w:rPr>
-                                  <m:t>E</m:t>
+                                  <m:t>K</m:t>
                                 </m:r>
                               </m:e>
                               <m:sub>
@@ -8141,41 +9517,15 @@
                                   <w:rPr>
                                     <w:rFonts w:ascii="Cambria Math" w:hAnsi="Cambria Math"/>
                                   </w:rPr>
-                                  <m:t>c</m:t>
+                                  <m:t>db</m:t>
                                 </m:r>
                               </m:sub>
                             </m:sSub>
-                            <m:sSub>
-                              <m:sSubPr>
-                                <m:ctrlPr>
-                                  <w:rPr>
-                                    <w:rFonts w:ascii="Cambria Math" w:hAnsi="Cambria Math"/>
-                                    <w:i/>
-                                  </w:rPr>
-                                </m:ctrlPr>
-                              </m:sSubPr>
-                              <m:e>
-                                <m:r>
-                                  <w:rPr>
-                                    <w:rFonts w:ascii="Cambria Math" w:hAnsi="Cambria Math"/>
-                                  </w:rPr>
-                                  <m:t>A</m:t>
-                                </m:r>
-                              </m:e>
-                              <m:sub>
-                                <m:r>
-                                  <w:rPr>
-                                    <w:rFonts w:ascii="Cambria Math" w:hAnsi="Cambria Math"/>
-                                  </w:rPr>
-                                  <m:t>c</m:t>
-                                </m:r>
-                              </m:sub>
-                            </m:sSub>
-                            <m:r>
-                              <w:rPr>
-                                <w:rFonts w:ascii="Cambria Math" w:hAnsi="Cambria Math"/>
-                              </w:rPr>
-                              <m:t>+E</m:t>
+                            <m:r>
+                              <w:rPr>
+                                <w:rFonts w:ascii="Cambria Math" w:hAnsi="Cambria Math"/>
+                              </w:rPr>
+                              <m:t>A</m:t>
                             </m:r>
                           </m:e>
                           <m:sub>
@@ -8187,32 +9537,6 @@
                             </m:r>
                           </m:sub>
                         </m:sSub>
-                        <m:sSub>
-                          <m:sSubPr>
-                            <m:ctrlPr>
-                              <w:rPr>
-                                <w:rFonts w:ascii="Cambria Math" w:hAnsi="Cambria Math"/>
-                                <w:i/>
-                              </w:rPr>
-                            </m:ctrlPr>
-                          </m:sSubPr>
-                          <m:e>
-                            <m:r>
-                              <w:rPr>
-                                <w:rFonts w:ascii="Cambria Math" w:hAnsi="Cambria Math"/>
-                              </w:rPr>
-                              <m:t>A</m:t>
-                            </m:r>
-                          </m:e>
-                          <m:sub>
-                            <m:r>
-                              <w:rPr>
-                                <w:rFonts w:ascii="Cambria Math" w:hAnsi="Cambria Math"/>
-                              </w:rPr>
-                              <m:t>s</m:t>
-                            </m:r>
-                          </m:sub>
-                        </m:sSub>
                         <m:r>
                           <w:rPr>
                             <w:rFonts w:ascii="Cambria Math" w:hAnsi="Cambria Math"/>
@@ -8242,6 +9566,32 @@
                                 <w:rFonts w:ascii="Cambria Math" w:hAnsi="Cambria Math"/>
                               </w:rPr>
                               <m:t>p</m:t>
+                            </m:r>
+                          </m:sub>
+                        </m:sSub>
+                        <m:sSub>
+                          <m:sSubPr>
+                            <m:ctrlPr>
+                              <w:rPr>
+                                <w:rFonts w:ascii="Cambria Math" w:hAnsi="Cambria Math"/>
+                                <w:i/>
+                              </w:rPr>
+                            </m:ctrlPr>
+                          </m:sSubPr>
+                          <m:e>
+                            <m:r>
+                              <w:rPr>
+                                <w:rFonts w:ascii="Cambria Math" w:hAnsi="Cambria Math"/>
+                              </w:rPr>
+                              <m:t>K</m:t>
+                            </m:r>
+                          </m:e>
+                          <m:sub>
+                            <m:r>
+                              <w:rPr>
+                                <w:rFonts w:ascii="Cambria Math" w:hAnsi="Cambria Math"/>
+                              </w:rPr>
+                              <m:t>ds</m:t>
                             </m:r>
                           </m:sub>
                         </m:sSub>
@@ -8535,6 +9885,32 @@
                   </m:ctrlPr>
                 </m:sSubPr>
                 <m:e>
+                  <m:sSub>
+                    <m:sSubPr>
+                      <m:ctrlPr>
+                        <w:rPr>
+                          <w:rFonts w:ascii="Cambria Math" w:hAnsi="Cambria Math"/>
+                          <w:i/>
+                        </w:rPr>
+                      </m:ctrlPr>
+                    </m:sSubPr>
+                    <m:e>
+                      <m:r>
+                        <w:rPr>
+                          <w:rFonts w:ascii="Cambria Math" w:hAnsi="Cambria Math"/>
+                        </w:rPr>
+                        <m:t>K</m:t>
+                      </m:r>
+                    </m:e>
+                    <m:sub>
+                      <m:r>
+                        <w:rPr>
+                          <w:rFonts w:ascii="Cambria Math" w:hAnsi="Cambria Math"/>
+                        </w:rPr>
+                        <m:t>dt</m:t>
+                      </m:r>
+                    </m:sub>
+                  </m:sSub>
                   <m:r>
                     <w:rPr>
                       <w:rFonts w:ascii="Cambria Math" w:hAnsi="Cambria Math"/>
@@ -8589,6 +9965,32 @@
                   </m:ctrlPr>
                 </m:sSubPr>
                 <m:e>
+                  <m:sSub>
+                    <m:sSubPr>
+                      <m:ctrlPr>
+                        <w:rPr>
+                          <w:rFonts w:ascii="Cambria Math" w:hAnsi="Cambria Math"/>
+                          <w:i/>
+                        </w:rPr>
+                      </m:ctrlPr>
+                    </m:sSubPr>
+                    <m:e>
+                      <m:r>
+                        <w:rPr>
+                          <w:rFonts w:ascii="Cambria Math" w:hAnsi="Cambria Math"/>
+                        </w:rPr>
+                        <m:t>K</m:t>
+                      </m:r>
+                    </m:e>
+                    <m:sub>
+                      <m:r>
+                        <w:rPr>
+                          <w:rFonts w:ascii="Cambria Math" w:hAnsi="Cambria Math"/>
+                        </w:rPr>
+                        <m:t>db</m:t>
+                      </m:r>
+                    </m:sub>
+                  </m:sSub>
                   <m:r>
                     <w:rPr>
                       <w:rFonts w:ascii="Cambria Math" w:hAnsi="Cambria Math"/>
@@ -8651,6 +10053,32 @@
                     <w:rPr>
                       <w:rFonts w:ascii="Cambria Math" w:hAnsi="Cambria Math"/>
                     </w:rPr>
+                    <m:t>K</m:t>
+                  </m:r>
+                </m:e>
+                <m:sub>
+                  <m:r>
+                    <w:rPr>
+                      <w:rFonts w:ascii="Cambria Math" w:hAnsi="Cambria Math"/>
+                    </w:rPr>
+                    <m:t>ds</m:t>
+                  </m:r>
+                </m:sub>
+              </m:sSub>
+              <m:sSub>
+                <m:sSubPr>
+                  <m:ctrlPr>
+                    <w:rPr>
+                      <w:rFonts w:ascii="Cambria Math" w:hAnsi="Cambria Math"/>
+                      <w:i/>
+                    </w:rPr>
+                  </m:ctrlPr>
+                </m:sSubPr>
+                <m:e>
+                  <m:r>
+                    <w:rPr>
+                      <w:rFonts w:ascii="Cambria Math" w:hAnsi="Cambria Math"/>
+                    </w:rPr>
                     <m:t>A</m:t>
                   </m:r>
                 </m:e>
@@ -8679,7 +10107,7 @@
 </file>
 
 <file path=word/styles.xml><?xml version="1.0" encoding="utf-8"?>
-<w:styles xmlns:r="http://schemas.openxmlformats.org/officeDocument/2006/relationships" xmlns:w="http://schemas.openxmlformats.org/wordprocessingml/2006/main">
+<w:styles xmlns:mc="http://schemas.openxmlformats.org/markup-compatibility/2006" xmlns:r="http://schemas.openxmlformats.org/officeDocument/2006/relationships" xmlns:w="http://schemas.openxmlformats.org/wordprocessingml/2006/main" xmlns:w14="http://schemas.microsoft.com/office/word/2010/wordml" xmlns:w15="http://schemas.microsoft.com/office/word/2012/wordml" xmlns:w16cex="http://schemas.microsoft.com/office/word/2018/wordml/cex" xmlns:w16cid="http://schemas.microsoft.com/office/word/2016/wordml/cid" xmlns:w16="http://schemas.microsoft.com/office/word/2018/wordml" xmlns:w16du="http://schemas.microsoft.com/office/word/2023/wordml/word16du" xmlns:w16sdtdh="http://schemas.microsoft.com/office/word/2020/wordml/sdtdatahash" xmlns:w16se="http://schemas.microsoft.com/office/word/2015/wordml/symex" mc:Ignorable="w14 w15 w16se w16cid w16 w16cex w16sdtdh w16du">
   <w:docDefaults>
     <w:rPrDefault>
       <w:rPr>
@@ -8695,144 +10123,383 @@
       </w:pPr>
     </w:pPrDefault>
   </w:docDefaults>
-  <w:latentStyles w:defLockedState="0" w:defUIPriority="99" w:defSemiHidden="1" w:defUnhideWhenUsed="1" w:defQFormat="0" w:count="267">
-    <w:lsdException w:name="Normal" w:semiHidden="0" w:uiPriority="0" w:unhideWhenUsed="0" w:qFormat="1"/>
-    <w:lsdException w:name="heading 1" w:semiHidden="0" w:uiPriority="9" w:unhideWhenUsed="0" w:qFormat="1"/>
-    <w:lsdException w:name="heading 2" w:uiPriority="9" w:qFormat="1"/>
-    <w:lsdException w:name="heading 3" w:uiPriority="9" w:qFormat="1"/>
-    <w:lsdException w:name="heading 4" w:uiPriority="9" w:qFormat="1"/>
-    <w:lsdException w:name="heading 5" w:uiPriority="9" w:qFormat="1"/>
-    <w:lsdException w:name="heading 6" w:uiPriority="9" w:qFormat="1"/>
-    <w:lsdException w:name="heading 7" w:uiPriority="9" w:qFormat="1"/>
-    <w:lsdException w:name="heading 8" w:uiPriority="9" w:qFormat="1"/>
-    <w:lsdException w:name="heading 9" w:uiPriority="9" w:qFormat="1"/>
-    <w:lsdException w:name="toc 1" w:uiPriority="39"/>
-    <w:lsdException w:name="toc 2" w:uiPriority="39"/>
-    <w:lsdException w:name="toc 3" w:uiPriority="39"/>
-    <w:lsdException w:name="toc 4" w:uiPriority="39"/>
-    <w:lsdException w:name="toc 5" w:uiPriority="39"/>
-    <w:lsdException w:name="toc 6" w:uiPriority="39"/>
-    <w:lsdException w:name="toc 7" w:uiPriority="39"/>
-    <w:lsdException w:name="toc 8" w:uiPriority="39"/>
-    <w:lsdException w:name="toc 9" w:uiPriority="39"/>
-    <w:lsdException w:name="caption" w:uiPriority="35" w:qFormat="1"/>
-    <w:lsdException w:name="Title" w:semiHidden="0" w:uiPriority="10" w:unhideWhenUsed="0" w:qFormat="1"/>
-    <w:lsdException w:name="Default Paragraph Font" w:uiPriority="1"/>
-    <w:lsdException w:name="Subtitle" w:semiHidden="0" w:uiPriority="11" w:unhideWhenUsed="0" w:qFormat="1"/>
-    <w:lsdException w:name="Strong" w:semiHidden="0" w:uiPriority="22" w:unhideWhenUsed="0" w:qFormat="1"/>
-    <w:lsdException w:name="Emphasis" w:semiHidden="0" w:uiPriority="20" w:unhideWhenUsed="0" w:qFormat="1"/>
-    <w:lsdException w:name="Table Grid" w:semiHidden="0" w:uiPriority="59" w:unhideWhenUsed="0"/>
-    <w:lsdException w:name="Placeholder Text" w:unhideWhenUsed="0"/>
-    <w:lsdException w:name="No Spacing" w:semiHidden="0" w:uiPriority="1" w:unhideWhenUsed="0" w:qFormat="1"/>
-    <w:lsdException w:name="Light Shading" w:semiHidden="0" w:uiPriority="60" w:unhideWhenUsed="0"/>
-    <w:lsdException w:name="Light List" w:semiHidden="0" w:uiPriority="61" w:unhideWhenUsed="0"/>
-    <w:lsdException w:name="Light Grid" w:semiHidden="0" w:uiPriority="62" w:unhideWhenUsed="0"/>
-    <w:lsdException w:name="Medium Shading 1" w:semiHidden="0" w:uiPriority="63" w:unhideWhenUsed="0"/>
-    <w:lsdException w:name="Medium Shading 2" w:semiHidden="0" w:uiPriority="64" w:unhideWhenUsed="0"/>
-    <w:lsdException w:name="Medium List 1" w:semiHidden="0" w:uiPriority="65" w:unhideWhenUsed="0"/>
-    <w:lsdException w:name="Medium List 2" w:semiHidden="0" w:uiPriority="66" w:unhideWhenUsed="0"/>
-    <w:lsdException w:name="Medium Grid 1" w:semiHidden="0" w:uiPriority="67" w:unhideWhenUsed="0"/>
-    <w:lsdException w:name="Medium Grid 2" w:semiHidden="0" w:uiPriority="68" w:unhideWhenUsed="0"/>
-    <w:lsdException w:name="Medium Grid 3" w:semiHidden="0" w:uiPriority="69" w:unhideWhenUsed="0"/>
-    <w:lsdException w:name="Dark List" w:semiHidden="0" w:uiPriority="70" w:unhideWhenUsed="0"/>
-    <w:lsdException w:name="Colorful Shading" w:semiHidden="0" w:uiPriority="71" w:unhideWhenUsed="0"/>
-    <w:lsdException w:name="Colorful List" w:semiHidden="0" w:uiPriority="72" w:unhideWhenUsed="0"/>
-    <w:lsdException w:name="Colorful Grid" w:semiHidden="0" w:uiPriority="73" w:unhideWhenUsed="0"/>
-    <w:lsdException w:name="Light Shading Accent 1" w:semiHidden="0" w:uiPriority="60" w:unhideWhenUsed="0"/>
-    <w:lsdException w:name="Light List Accent 1" w:semiHidden="0" w:uiPriority="61" w:unhideWhenUsed="0"/>
-    <w:lsdException w:name="Light Grid Accent 1" w:semiHidden="0" w:uiPriority="62" w:unhideWhenUsed="0"/>
-    <w:lsdException w:name="Medium Shading 1 Accent 1" w:semiHidden="0" w:uiPriority="63" w:unhideWhenUsed="0"/>
-    <w:lsdException w:name="Medium Shading 2 Accent 1" w:semiHidden="0" w:uiPriority="64" w:unhideWhenUsed="0"/>
-    <w:lsdException w:name="Medium List 1 Accent 1" w:semiHidden="0" w:uiPriority="65" w:unhideWhenUsed="0"/>
-    <w:lsdException w:name="Revision" w:unhideWhenUsed="0"/>
-    <w:lsdException w:name="List Paragraph" w:semiHidden="0" w:uiPriority="34" w:unhideWhenUsed="0" w:qFormat="1"/>
-    <w:lsdException w:name="Quote" w:semiHidden="0" w:uiPriority="29" w:unhideWhenUsed="0" w:qFormat="1"/>
-    <w:lsdException w:name="Intense Quote" w:semiHidden="0" w:uiPriority="30" w:unhideWhenUsed="0" w:qFormat="1"/>
-    <w:lsdException w:name="Medium List 2 Accent 1" w:semiHidden="0" w:uiPriority="66" w:unhideWhenUsed="0"/>
-    <w:lsdException w:name="Medium Grid 1 Accent 1" w:semiHidden="0" w:uiPriority="67" w:unhideWhenUsed="0"/>
-    <w:lsdException w:name="Medium Grid 2 Accent 1" w:semiHidden="0" w:uiPriority="68" w:unhideWhenUsed="0"/>
-    <w:lsdException w:name="Medium Grid 3 Accent 1" w:semiHidden="0" w:uiPriority="69" w:unhideWhenUsed="0"/>
-    <w:lsdException w:name="Dark List Accent 1" w:semiHidden="0" w:uiPriority="70" w:unhideWhenUsed="0"/>
-    <w:lsdException w:name="Colorful Shading Accent 1" w:semiHidden="0" w:uiPriority="71" w:unhideWhenUsed="0"/>
-    <w:lsdException w:name="Colorful List Accent 1" w:semiHidden="0" w:uiPriority="72" w:unhideWhenUsed="0"/>
-    <w:lsdException w:name="Colorful Grid Accent 1" w:semiHidden="0" w:uiPriority="73" w:unhideWhenUsed="0"/>
-    <w:lsdException w:name="Light Shading Accent 2" w:semiHidden="0" w:uiPriority="60" w:unhideWhenUsed="0"/>
-    <w:lsdException w:name="Light List Accent 2" w:semiHidden="0" w:uiPriority="61" w:unhideWhenUsed="0"/>
-    <w:lsdException w:name="Light Grid Accent 2" w:semiHidden="0" w:uiPriority="62" w:unhideWhenUsed="0"/>
-    <w:lsdException w:name="Medium Shading 1 Accent 2" w:semiHidden="0" w:uiPriority="63" w:unhideWhenUsed="0"/>
-    <w:lsdException w:name="Medium Shading 2 Accent 2" w:semiHidden="0" w:uiPriority="64" w:unhideWhenUsed="0"/>
-    <w:lsdException w:name="Medium List 1 Accent 2" w:semiHidden="0" w:uiPriority="65" w:unhideWhenUsed="0"/>
-    <w:lsdException w:name="Medium List 2 Accent 2" w:semiHidden="0" w:uiPriority="66" w:unhideWhenUsed="0"/>
-    <w:lsdException w:name="Medium Grid 1 Accent 2" w:semiHidden="0" w:uiPriority="67" w:unhideWhenUsed="0"/>
-    <w:lsdException w:name="Medium Grid 2 Accent 2" w:semiHidden="0" w:uiPriority="68" w:unhideWhenUsed="0"/>
-    <w:lsdException w:name="Medium Grid 3 Accent 2" w:semiHidden="0" w:uiPriority="69" w:unhideWhenUsed="0"/>
-    <w:lsdException w:name="Dark List Accent 2" w:semiHidden="0" w:uiPriority="70" w:unhideWhenUsed="0"/>
-    <w:lsdException w:name="Colorful Shading Accent 2" w:semiHidden="0" w:uiPriority="71" w:unhideWhenUsed="0"/>
-    <w:lsdException w:name="Colorful List Accent 2" w:semiHidden="0" w:uiPriority="72" w:unhideWhenUsed="0"/>
-    <w:lsdException w:name="Colorful Grid Accent 2" w:semiHidden="0" w:uiPriority="73" w:unhideWhenUsed="0"/>
-    <w:lsdException w:name="Light Shading Accent 3" w:semiHidden="0" w:uiPriority="60" w:unhideWhenUsed="0"/>
-    <w:lsdException w:name="Light List Accent 3" w:semiHidden="0" w:uiPriority="61" w:unhideWhenUsed="0"/>
-    <w:lsdException w:name="Light Grid Accent 3" w:semiHidden="0" w:uiPriority="62" w:unhideWhenUsed="0"/>
-    <w:lsdException w:name="Medium Shading 1 Accent 3" w:semiHidden="0" w:uiPriority="63" w:unhideWhenUsed="0"/>
-    <w:lsdException w:name="Medium Shading 2 Accent 3" w:semiHidden="0" w:uiPriority="64" w:unhideWhenUsed="0"/>
-    <w:lsdException w:name="Medium List 1 Accent 3" w:semiHidden="0" w:uiPriority="65" w:unhideWhenUsed="0"/>
-    <w:lsdException w:name="Medium List 2 Accent 3" w:semiHidden="0" w:uiPriority="66" w:unhideWhenUsed="0"/>
-    <w:lsdException w:name="Medium Grid 1 Accent 3" w:semiHidden="0" w:uiPriority="67" w:unhideWhenUsed="0"/>
-    <w:lsdException w:name="Medium Grid 2 Accent 3" w:semiHidden="0" w:uiPriority="68" w:unhideWhenUsed="0"/>
-    <w:lsdException w:name="Medium Grid 3 Accent 3" w:semiHidden="0" w:uiPriority="69" w:unhideWhenUsed="0"/>
-    <w:lsdException w:name="Dark List Accent 3" w:semiHidden="0" w:uiPriority="70" w:unhideWhenUsed="0"/>
-    <w:lsdException w:name="Colorful Shading Accent 3" w:semiHidden="0" w:uiPriority="71" w:unhideWhenUsed="0"/>
-    <w:lsdException w:name="Colorful List Accent 3" w:semiHidden="0" w:uiPriority="72" w:unhideWhenUsed="0"/>
-    <w:lsdException w:name="Colorful Grid Accent 3" w:semiHidden="0" w:uiPriority="73" w:unhideWhenUsed="0"/>
-    <w:lsdException w:name="Light Shading Accent 4" w:semiHidden="0" w:uiPriority="60" w:unhideWhenUsed="0"/>
-    <w:lsdException w:name="Light List Accent 4" w:semiHidden="0" w:uiPriority="61" w:unhideWhenUsed="0"/>
-    <w:lsdException w:name="Light Grid Accent 4" w:semiHidden="0" w:uiPriority="62" w:unhideWhenUsed="0"/>
-    <w:lsdException w:name="Medium Shading 1 Accent 4" w:semiHidden="0" w:uiPriority="63" w:unhideWhenUsed="0"/>
-    <w:lsdException w:name="Medium Shading 2 Accent 4" w:semiHidden="0" w:uiPriority="64" w:unhideWhenUsed="0"/>
-    <w:lsdException w:name="Medium List 1 Accent 4" w:semiHidden="0" w:uiPriority="65" w:unhideWhenUsed="0"/>
-    <w:lsdException w:name="Medium List 2 Accent 4" w:semiHidden="0" w:uiPriority="66" w:unhideWhenUsed="0"/>
-    <w:lsdException w:name="Medium Grid 1 Accent 4" w:semiHidden="0" w:uiPriority="67" w:unhideWhenUsed="0"/>
-    <w:lsdException w:name="Medium Grid 2 Accent 4" w:semiHidden="0" w:uiPriority="68" w:unhideWhenUsed="0"/>
-    <w:lsdException w:name="Medium Grid 3 Accent 4" w:semiHidden="0" w:uiPriority="69" w:unhideWhenUsed="0"/>
-    <w:lsdException w:name="Dark List Accent 4" w:semiHidden="0" w:uiPriority="70" w:unhideWhenUsed="0"/>
-    <w:lsdException w:name="Colorful Shading Accent 4" w:semiHidden="0" w:uiPriority="71" w:unhideWhenUsed="0"/>
-    <w:lsdException w:name="Colorful List Accent 4" w:semiHidden="0" w:uiPriority="72" w:unhideWhenUsed="0"/>
-    <w:lsdException w:name="Colorful Grid Accent 4" w:semiHidden="0" w:uiPriority="73" w:unhideWhenUsed="0"/>
-    <w:lsdException w:name="Light Shading Accent 5" w:semiHidden="0" w:uiPriority="60" w:unhideWhenUsed="0"/>
-    <w:lsdException w:name="Light List Accent 5" w:semiHidden="0" w:uiPriority="61" w:unhideWhenUsed="0"/>
-    <w:lsdException w:name="Light Grid Accent 5" w:semiHidden="0" w:uiPriority="62" w:unhideWhenUsed="0"/>
-    <w:lsdException w:name="Medium Shading 1 Accent 5" w:semiHidden="0" w:uiPriority="63" w:unhideWhenUsed="0"/>
-    <w:lsdException w:name="Medium Shading 2 Accent 5" w:semiHidden="0" w:uiPriority="64" w:unhideWhenUsed="0"/>
-    <w:lsdException w:name="Medium List 1 Accent 5" w:semiHidden="0" w:uiPriority="65" w:unhideWhenUsed="0"/>
-    <w:lsdException w:name="Medium List 2 Accent 5" w:semiHidden="0" w:uiPriority="66" w:unhideWhenUsed="0"/>
-    <w:lsdException w:name="Medium Grid 1 Accent 5" w:semiHidden="0" w:uiPriority="67" w:unhideWhenUsed="0"/>
-    <w:lsdException w:name="Medium Grid 2 Accent 5" w:semiHidden="0" w:uiPriority="68" w:unhideWhenUsed="0"/>
-    <w:lsdException w:name="Medium Grid 3 Accent 5" w:semiHidden="0" w:uiPriority="69" w:unhideWhenUsed="0"/>
-    <w:lsdException w:name="Dark List Accent 5" w:semiHidden="0" w:uiPriority="70" w:unhideWhenUsed="0"/>
-    <w:lsdException w:name="Colorful Shading Accent 5" w:semiHidden="0" w:uiPriority="71" w:unhideWhenUsed="0"/>
-    <w:lsdException w:name="Colorful List Accent 5" w:semiHidden="0" w:uiPriority="72" w:unhideWhenUsed="0"/>
-    <w:lsdException w:name="Colorful Grid Accent 5" w:semiHidden="0" w:uiPriority="73" w:unhideWhenUsed="0"/>
-    <w:lsdException w:name="Light Shading Accent 6" w:semiHidden="0" w:uiPriority="60" w:unhideWhenUsed="0"/>
-    <w:lsdException w:name="Light List Accent 6" w:semiHidden="0" w:uiPriority="61" w:unhideWhenUsed="0"/>
-    <w:lsdException w:name="Light Grid Accent 6" w:semiHidden="0" w:uiPriority="62" w:unhideWhenUsed="0"/>
-    <w:lsdException w:name="Medium Shading 1 Accent 6" w:semiHidden="0" w:uiPriority="63" w:unhideWhenUsed="0"/>
-    <w:lsdException w:name="Medium Shading 2 Accent 6" w:semiHidden="0" w:uiPriority="64" w:unhideWhenUsed="0"/>
-    <w:lsdException w:name="Medium List 1 Accent 6" w:semiHidden="0" w:uiPriority="65" w:unhideWhenUsed="0"/>
-    <w:lsdException w:name="Medium List 2 Accent 6" w:semiHidden="0" w:uiPriority="66" w:unhideWhenUsed="0"/>
-    <w:lsdException w:name="Medium Grid 1 Accent 6" w:semiHidden="0" w:uiPriority="67" w:unhideWhenUsed="0"/>
-    <w:lsdException w:name="Medium Grid 2 Accent 6" w:semiHidden="0" w:uiPriority="68" w:unhideWhenUsed="0"/>
-    <w:lsdException w:name="Medium Grid 3 Accent 6" w:semiHidden="0" w:uiPriority="69" w:unhideWhenUsed="0"/>
-    <w:lsdException w:name="Dark List Accent 6" w:semiHidden="0" w:uiPriority="70" w:unhideWhenUsed="0"/>
-    <w:lsdException w:name="Colorful Shading Accent 6" w:semiHidden="0" w:uiPriority="71" w:unhideWhenUsed="0"/>
-    <w:lsdException w:name="Colorful List Accent 6" w:semiHidden="0" w:uiPriority="72" w:unhideWhenUsed="0"/>
-    <w:lsdException w:name="Colorful Grid Accent 6" w:semiHidden="0" w:uiPriority="73" w:unhideWhenUsed="0"/>
-    <w:lsdException w:name="Subtle Emphasis" w:semiHidden="0" w:uiPriority="19" w:unhideWhenUsed="0" w:qFormat="1"/>
-    <w:lsdException w:name="Intense Emphasis" w:semiHidden="0" w:uiPriority="21" w:unhideWhenUsed="0" w:qFormat="1"/>
-    <w:lsdException w:name="Subtle Reference" w:semiHidden="0" w:uiPriority="31" w:unhideWhenUsed="0" w:qFormat="1"/>
-    <w:lsdException w:name="Intense Reference" w:semiHidden="0" w:uiPriority="32" w:unhideWhenUsed="0" w:qFormat="1"/>
-    <w:lsdException w:name="Book Title" w:semiHidden="0" w:uiPriority="33" w:unhideWhenUsed="0" w:qFormat="1"/>
-    <w:lsdException w:name="Bibliography" w:uiPriority="37"/>
-    <w:lsdException w:name="TOC Heading" w:uiPriority="39" w:qFormat="1"/>
+  <w:latentStyles w:defLockedState="0" w:defUIPriority="99" w:defSemiHidden="0" w:defUnhideWhenUsed="0" w:defQFormat="0" w:count="376">
+    <w:lsdException w:name="Normal" w:uiPriority="0" w:qFormat="1"/>
+    <w:lsdException w:name="heading 1" w:uiPriority="9" w:qFormat="1"/>
+    <w:lsdException w:name="heading 2" w:semiHidden="1" w:uiPriority="9" w:unhideWhenUsed="1" w:qFormat="1"/>
+    <w:lsdException w:name="heading 3" w:semiHidden="1" w:uiPriority="9" w:unhideWhenUsed="1" w:qFormat="1"/>
+    <w:lsdException w:name="heading 4" w:semiHidden="1" w:uiPriority="9" w:unhideWhenUsed="1" w:qFormat="1"/>
+    <w:lsdException w:name="heading 5" w:semiHidden="1" w:uiPriority="9" w:unhideWhenUsed="1" w:qFormat="1"/>
+    <w:lsdException w:name="heading 6" w:semiHidden="1" w:uiPriority="9" w:unhideWhenUsed="1" w:qFormat="1"/>
+    <w:lsdException w:name="heading 7" w:semiHidden="1" w:uiPriority="9" w:unhideWhenUsed="1" w:qFormat="1"/>
+    <w:lsdException w:name="heading 8" w:semiHidden="1" w:uiPriority="9" w:unhideWhenUsed="1" w:qFormat="1"/>
+    <w:lsdException w:name="heading 9" w:semiHidden="1" w:uiPriority="9" w:unhideWhenUsed="1" w:qFormat="1"/>
+    <w:lsdException w:name="index 1" w:semiHidden="1" w:unhideWhenUsed="1"/>
+    <w:lsdException w:name="index 2" w:semiHidden="1" w:unhideWhenUsed="1"/>
+    <w:lsdException w:name="index 3" w:semiHidden="1" w:unhideWhenUsed="1"/>
+    <w:lsdException w:name="index 4" w:semiHidden="1" w:unhideWhenUsed="1"/>
+    <w:lsdException w:name="index 5" w:semiHidden="1" w:unhideWhenUsed="1"/>
+    <w:lsdException w:name="index 6" w:semiHidden="1" w:unhideWhenUsed="1"/>
+    <w:lsdException w:name="index 7" w:semiHidden="1" w:unhideWhenUsed="1"/>
+    <w:lsdException w:name="index 8" w:semiHidden="1" w:unhideWhenUsed="1"/>
+    <w:lsdException w:name="index 9" w:semiHidden="1" w:unhideWhenUsed="1"/>
+    <w:lsdException w:name="toc 1" w:semiHidden="1" w:uiPriority="39" w:unhideWhenUsed="1"/>
+    <w:lsdException w:name="toc 2" w:semiHidden="1" w:uiPriority="39" w:unhideWhenUsed="1"/>
+    <w:lsdException w:name="toc 3" w:semiHidden="1" w:uiPriority="39" w:unhideWhenUsed="1"/>
+    <w:lsdException w:name="toc 4" w:semiHidden="1" w:uiPriority="39" w:unhideWhenUsed="1"/>
+    <w:lsdException w:name="toc 5" w:semiHidden="1" w:uiPriority="39" w:unhideWhenUsed="1"/>
+    <w:lsdException w:name="toc 6" w:semiHidden="1" w:uiPriority="39" w:unhideWhenUsed="1"/>
+    <w:lsdException w:name="toc 7" w:semiHidden="1" w:uiPriority="39" w:unhideWhenUsed="1"/>
+    <w:lsdException w:name="toc 8" w:semiHidden="1" w:uiPriority="39" w:unhideWhenUsed="1"/>
+    <w:lsdException w:name="toc 9" w:semiHidden="1" w:uiPriority="39" w:unhideWhenUsed="1"/>
+    <w:lsdException w:name="Normal Indent" w:semiHidden="1" w:unhideWhenUsed="1"/>
+    <w:lsdException w:name="footnote text" w:semiHidden="1" w:unhideWhenUsed="1"/>
+    <w:lsdException w:name="annotation text" w:semiHidden="1" w:unhideWhenUsed="1"/>
+    <w:lsdException w:name="header" w:semiHidden="1" w:unhideWhenUsed="1"/>
+    <w:lsdException w:name="footer" w:semiHidden="1" w:unhideWhenUsed="1"/>
+    <w:lsdException w:name="index heading" w:semiHidden="1" w:unhideWhenUsed="1"/>
+    <w:lsdException w:name="caption" w:semiHidden="1" w:uiPriority="35" w:unhideWhenUsed="1" w:qFormat="1"/>
+    <w:lsdException w:name="table of figures" w:semiHidden="1" w:unhideWhenUsed="1"/>
+    <w:lsdException w:name="envelope address" w:semiHidden="1" w:unhideWhenUsed="1"/>
+    <w:lsdException w:name="envelope return" w:semiHidden="1" w:unhideWhenUsed="1"/>
+    <w:lsdException w:name="footnote reference" w:semiHidden="1" w:unhideWhenUsed="1"/>
+    <w:lsdException w:name="annotation reference" w:semiHidden="1" w:unhideWhenUsed="1"/>
+    <w:lsdException w:name="line number" w:semiHidden="1" w:unhideWhenUsed="1"/>
+    <w:lsdException w:name="page number" w:semiHidden="1" w:unhideWhenUsed="1"/>
+    <w:lsdException w:name="endnote reference" w:semiHidden="1" w:unhideWhenUsed="1"/>
+    <w:lsdException w:name="endnote text" w:semiHidden="1" w:unhideWhenUsed="1"/>
+    <w:lsdException w:name="table of authorities" w:semiHidden="1" w:unhideWhenUsed="1"/>
+    <w:lsdException w:name="macro" w:semiHidden="1" w:unhideWhenUsed="1"/>
+    <w:lsdException w:name="toa heading" w:semiHidden="1" w:unhideWhenUsed="1"/>
+    <w:lsdException w:name="List" w:semiHidden="1" w:unhideWhenUsed="1"/>
+    <w:lsdException w:name="List Bullet" w:semiHidden="1" w:unhideWhenUsed="1"/>
+    <w:lsdException w:name="List Number" w:semiHidden="1" w:unhideWhenUsed="1"/>
+    <w:lsdException w:name="List 2" w:semiHidden="1" w:unhideWhenUsed="1"/>
+    <w:lsdException w:name="List 3" w:semiHidden="1" w:unhideWhenUsed="1"/>
+    <w:lsdException w:name="List 4" w:semiHidden="1" w:unhideWhenUsed="1"/>
+    <w:lsdException w:name="List 5" w:semiHidden="1" w:unhideWhenUsed="1"/>
+    <w:lsdException w:name="List Bullet 2" w:semiHidden="1" w:unhideWhenUsed="1"/>
+    <w:lsdException w:name="List Bullet 3" w:semiHidden="1" w:unhideWhenUsed="1"/>
+    <w:lsdException w:name="List Bullet 4" w:semiHidden="1" w:unhideWhenUsed="1"/>
+    <w:lsdException w:name="List Bullet 5" w:semiHidden="1" w:unhideWhenUsed="1"/>
+    <w:lsdException w:name="List Number 2" w:semiHidden="1" w:unhideWhenUsed="1"/>
+    <w:lsdException w:name="List Number 3" w:semiHidden="1" w:unhideWhenUsed="1"/>
+    <w:lsdException w:name="List Number 4" w:semiHidden="1" w:unhideWhenUsed="1"/>
+    <w:lsdException w:name="List Number 5" w:semiHidden="1" w:unhideWhenUsed="1"/>
+    <w:lsdException w:name="Title" w:uiPriority="10" w:qFormat="1"/>
+    <w:lsdException w:name="Closing" w:semiHidden="1" w:unhideWhenUsed="1"/>
+    <w:lsdException w:name="Signature" w:semiHidden="1" w:unhideWhenUsed="1"/>
+    <w:lsdException w:name="Default Paragraph Font" w:semiHidden="1" w:uiPriority="1" w:unhideWhenUsed="1"/>
+    <w:lsdException w:name="Body Text" w:semiHidden="1" w:unhideWhenUsed="1"/>
+    <w:lsdException w:name="Body Text Indent" w:semiHidden="1" w:unhideWhenUsed="1"/>
+    <w:lsdException w:name="List Continue" w:semiHidden="1" w:unhideWhenUsed="1"/>
+    <w:lsdException w:name="List Continue 2" w:semiHidden="1" w:unhideWhenUsed="1"/>
+    <w:lsdException w:name="List Continue 3" w:semiHidden="1" w:unhideWhenUsed="1"/>
+    <w:lsdException w:name="List Continue 4" w:semiHidden="1" w:unhideWhenUsed="1"/>
+    <w:lsdException w:name="List Continue 5" w:semiHidden="1" w:unhideWhenUsed="1"/>
+    <w:lsdException w:name="Message Header" w:semiHidden="1" w:unhideWhenUsed="1"/>
+    <w:lsdException w:name="Subtitle" w:uiPriority="11" w:qFormat="1"/>
+    <w:lsdException w:name="Salutation" w:semiHidden="1" w:unhideWhenUsed="1"/>
+    <w:lsdException w:name="Date" w:semiHidden="1" w:unhideWhenUsed="1"/>
+    <w:lsdException w:name="Body Text First Indent" w:semiHidden="1" w:unhideWhenUsed="1"/>
+    <w:lsdException w:name="Body Text First Indent 2" w:semiHidden="1" w:unhideWhenUsed="1"/>
+    <w:lsdException w:name="Note Heading" w:semiHidden="1" w:unhideWhenUsed="1"/>
+    <w:lsdException w:name="Body Text 2" w:semiHidden="1" w:unhideWhenUsed="1"/>
+    <w:lsdException w:name="Body Text 3" w:semiHidden="1" w:unhideWhenUsed="1"/>
+    <w:lsdException w:name="Body Text Indent 2" w:semiHidden="1" w:unhideWhenUsed="1"/>
+    <w:lsdException w:name="Body Text Indent 3" w:semiHidden="1" w:unhideWhenUsed="1"/>
+    <w:lsdException w:name="Block Text" w:semiHidden="1" w:unhideWhenUsed="1"/>
+    <w:lsdException w:name="Hyperlink" w:semiHidden="1" w:unhideWhenUsed="1"/>
+    <w:lsdException w:name="FollowedHyperlink" w:semiHidden="1" w:unhideWhenUsed="1"/>
+    <w:lsdException w:name="Strong" w:uiPriority="22" w:qFormat="1"/>
+    <w:lsdException w:name="Emphasis" w:uiPriority="20" w:qFormat="1"/>
+    <w:lsdException w:name="Document Map" w:semiHidden="1" w:unhideWhenUsed="1"/>
+    <w:lsdException w:name="Plain Text" w:semiHidden="1" w:unhideWhenUsed="1"/>
+    <w:lsdException w:name="E-mail Signature" w:semiHidden="1" w:unhideWhenUsed="1"/>
+    <w:lsdException w:name="HTML Top of Form" w:semiHidden="1" w:unhideWhenUsed="1"/>
+    <w:lsdException w:name="HTML Bottom of Form" w:semiHidden="1" w:unhideWhenUsed="1"/>
+    <w:lsdException w:name="Normal (Web)" w:semiHidden="1" w:unhideWhenUsed="1"/>
+    <w:lsdException w:name="HTML Acronym" w:semiHidden="1" w:unhideWhenUsed="1"/>
+    <w:lsdException w:name="HTML Address" w:semiHidden="1" w:unhideWhenUsed="1"/>
+    <w:lsdException w:name="HTML Cite" w:semiHidden="1" w:unhideWhenUsed="1"/>
+    <w:lsdException w:name="HTML Code" w:semiHidden="1" w:unhideWhenUsed="1"/>
+    <w:lsdException w:name="HTML Definition" w:semiHidden="1" w:unhideWhenUsed="1"/>
+    <w:lsdException w:name="HTML Keyboard" w:semiHidden="1" w:unhideWhenUsed="1"/>
+    <w:lsdException w:name="HTML Preformatted" w:semiHidden="1" w:unhideWhenUsed="1"/>
+    <w:lsdException w:name="HTML Sample" w:semiHidden="1" w:unhideWhenUsed="1"/>
+    <w:lsdException w:name="HTML Typewriter" w:semiHidden="1" w:unhideWhenUsed="1"/>
+    <w:lsdException w:name="HTML Variable" w:semiHidden="1" w:unhideWhenUsed="1"/>
+    <w:lsdException w:name="Normal Table" w:semiHidden="1" w:unhideWhenUsed="1"/>
+    <w:lsdException w:name="annotation subject" w:semiHidden="1" w:unhideWhenUsed="1"/>
+    <w:lsdException w:name="No List" w:semiHidden="1" w:unhideWhenUsed="1"/>
+    <w:lsdException w:name="Outline List 1" w:semiHidden="1" w:unhideWhenUsed="1"/>
+    <w:lsdException w:name="Outline List 2" w:semiHidden="1" w:unhideWhenUsed="1"/>
+    <w:lsdException w:name="Outline List 3" w:semiHidden="1" w:unhideWhenUsed="1"/>
+    <w:lsdException w:name="Table Simple 1" w:semiHidden="1" w:unhideWhenUsed="1"/>
+    <w:lsdException w:name="Table Simple 2" w:semiHidden="1" w:unhideWhenUsed="1"/>
+    <w:lsdException w:name="Table Simple 3" w:semiHidden="1" w:unhideWhenUsed="1"/>
+    <w:lsdException w:name="Table Classic 1" w:semiHidden="1" w:unhideWhenUsed="1"/>
+    <w:lsdException w:name="Table Classic 2" w:semiHidden="1" w:unhideWhenUsed="1"/>
+    <w:lsdException w:name="Table Classic 3" w:semiHidden="1" w:unhideWhenUsed="1"/>
+    <w:lsdException w:name="Table Classic 4" w:semiHidden="1" w:unhideWhenUsed="1"/>
+    <w:lsdException w:name="Table Colorful 1" w:semiHidden="1" w:unhideWhenUsed="1"/>
+    <w:lsdException w:name="Table Colorful 2" w:semiHidden="1" w:unhideWhenUsed="1"/>
+    <w:lsdException w:name="Table Colorful 3" w:semiHidden="1" w:unhideWhenUsed="1"/>
+    <w:lsdException w:name="Table Columns 1" w:semiHidden="1" w:unhideWhenUsed="1"/>
+    <w:lsdException w:name="Table Columns 2" w:semiHidden="1" w:unhideWhenUsed="1"/>
+    <w:lsdException w:name="Table Columns 3" w:semiHidden="1" w:unhideWhenUsed="1"/>
+    <w:lsdException w:name="Table Columns 4" w:semiHidden="1" w:unhideWhenUsed="1"/>
+    <w:lsdException w:name="Table Columns 5" w:semiHidden="1" w:unhideWhenUsed="1"/>
+    <w:lsdException w:name="Table Grid 1" w:semiHidden="1" w:unhideWhenUsed="1"/>
+    <w:lsdException w:name="Table Grid 2" w:semiHidden="1" w:unhideWhenUsed="1"/>
+    <w:lsdException w:name="Table Grid 3" w:semiHidden="1" w:unhideWhenUsed="1"/>
+    <w:lsdException w:name="Table Grid 4" w:semiHidden="1" w:unhideWhenUsed="1"/>
+    <w:lsdException w:name="Table Grid 5" w:semiHidden="1" w:unhideWhenUsed="1"/>
+    <w:lsdException w:name="Table Grid 6" w:semiHidden="1" w:unhideWhenUsed="1"/>
+    <w:lsdException w:name="Table Grid 7" w:semiHidden="1" w:unhideWhenUsed="1"/>
+    <w:lsdException w:name="Table Grid 8" w:semiHidden="1" w:unhideWhenUsed="1"/>
+    <w:lsdException w:name="Table List 1" w:semiHidden="1" w:unhideWhenUsed="1"/>
+    <w:lsdException w:name="Table List 2" w:semiHidden="1" w:unhideWhenUsed="1"/>
+    <w:lsdException w:name="Table List 3" w:semiHidden="1" w:unhideWhenUsed="1"/>
+    <w:lsdException w:name="Table List 4" w:semiHidden="1" w:unhideWhenUsed="1"/>
+    <w:lsdException w:name="Table List 5" w:semiHidden="1" w:unhideWhenUsed="1"/>
+    <w:lsdException w:name="Table List 6" w:semiHidden="1" w:unhideWhenUsed="1"/>
+    <w:lsdException w:name="Table List 7" w:semiHidden="1" w:unhideWhenUsed="1"/>
+    <w:lsdException w:name="Table List 8" w:semiHidden="1" w:unhideWhenUsed="1"/>
+    <w:lsdException w:name="Table 3D effects 1" w:semiHidden="1" w:unhideWhenUsed="1"/>
+    <w:lsdException w:name="Table 3D effects 2" w:semiHidden="1" w:unhideWhenUsed="1"/>
+    <w:lsdException w:name="Table 3D effects 3" w:semiHidden="1" w:unhideWhenUsed="1"/>
+    <w:lsdException w:name="Table Contemporary" w:semiHidden="1" w:unhideWhenUsed="1"/>
+    <w:lsdException w:name="Table Elegant" w:semiHidden="1" w:unhideWhenUsed="1"/>
+    <w:lsdException w:name="Table Professional" w:semiHidden="1" w:unhideWhenUsed="1"/>
+    <w:lsdException w:name="Table Subtle 1" w:semiHidden="1" w:unhideWhenUsed="1"/>
+    <w:lsdException w:name="Table Subtle 2" w:semiHidden="1" w:unhideWhenUsed="1"/>
+    <w:lsdException w:name="Table Web 1" w:semiHidden="1" w:unhideWhenUsed="1"/>
+    <w:lsdException w:name="Table Web 2" w:semiHidden="1" w:unhideWhenUsed="1"/>
+    <w:lsdException w:name="Table Web 3" w:semiHidden="1" w:unhideWhenUsed="1"/>
+    <w:lsdException w:name="Balloon Text" w:semiHidden="1" w:unhideWhenUsed="1"/>
+    <w:lsdException w:name="Table Grid" w:uiPriority="59"/>
+    <w:lsdException w:name="Table Theme" w:semiHidden="1" w:unhideWhenUsed="1"/>
+    <w:lsdException w:name="Placeholder Text" w:semiHidden="1"/>
+    <w:lsdException w:name="No Spacing" w:uiPriority="1" w:qFormat="1"/>
+    <w:lsdException w:name="Light Shading" w:uiPriority="60"/>
+    <w:lsdException w:name="Light List" w:uiPriority="61"/>
+    <w:lsdException w:name="Light Grid" w:uiPriority="62"/>
+    <w:lsdException w:name="Medium Shading 1" w:uiPriority="63"/>
+    <w:lsdException w:name="Medium Shading 2" w:uiPriority="64"/>
+    <w:lsdException w:name="Medium List 1" w:uiPriority="65"/>
+    <w:lsdException w:name="Medium List 2" w:uiPriority="66"/>
+    <w:lsdException w:name="Medium Grid 1" w:uiPriority="67"/>
+    <w:lsdException w:name="Medium Grid 2" w:uiPriority="68"/>
+    <w:lsdException w:name="Medium Grid 3" w:uiPriority="69"/>
+    <w:lsdException w:name="Dark List" w:uiPriority="70"/>
+    <w:lsdException w:name="Colorful Shading" w:uiPriority="71"/>
+    <w:lsdException w:name="Colorful List" w:uiPriority="72"/>
+    <w:lsdException w:name="Colorful Grid" w:uiPriority="73"/>
+    <w:lsdException w:name="Light Shading Accent 1" w:uiPriority="60"/>
+    <w:lsdException w:name="Light List Accent 1" w:uiPriority="61"/>
+    <w:lsdException w:name="Light Grid Accent 1" w:uiPriority="62"/>
+    <w:lsdException w:name="Medium Shading 1 Accent 1" w:uiPriority="63"/>
+    <w:lsdException w:name="Medium Shading 2 Accent 1" w:uiPriority="64"/>
+    <w:lsdException w:name="Medium List 1 Accent 1" w:uiPriority="65"/>
+    <w:lsdException w:name="Revision" w:semiHidden="1"/>
+    <w:lsdException w:name="List Paragraph" w:uiPriority="34" w:qFormat="1"/>
+    <w:lsdException w:name="Quote" w:uiPriority="29" w:qFormat="1"/>
+    <w:lsdException w:name="Intense Quote" w:uiPriority="30" w:qFormat="1"/>
+    <w:lsdException w:name="Medium List 2 Accent 1" w:uiPriority="66"/>
+    <w:lsdException w:name="Medium Grid 1 Accent 1" w:uiPriority="67"/>
+    <w:lsdException w:name="Medium Grid 2 Accent 1" w:uiPriority="68"/>
+    <w:lsdException w:name="Medium Grid 3 Accent 1" w:uiPriority="69"/>
+    <w:lsdException w:name="Dark List Accent 1" w:uiPriority="70"/>
+    <w:lsdException w:name="Colorful Shading Accent 1" w:uiPriority="71"/>
+    <w:lsdException w:name="Colorful List Accent 1" w:uiPriority="72"/>
+    <w:lsdException w:name="Colorful Grid Accent 1" w:uiPriority="73"/>
+    <w:lsdException w:name="Light Shading Accent 2" w:uiPriority="60"/>
+    <w:lsdException w:name="Light List Accent 2" w:uiPriority="61"/>
+    <w:lsdException w:name="Light Grid Accent 2" w:uiPriority="62"/>
+    <w:lsdException w:name="Medium Shading 1 Accent 2" w:uiPriority="63"/>
+    <w:lsdException w:name="Medium Shading 2 Accent 2" w:uiPriority="64"/>
+    <w:lsdException w:name="Medium List 1 Accent 2" w:uiPriority="65"/>
+    <w:lsdException w:name="Medium List 2 Accent 2" w:uiPriority="66"/>
+    <w:lsdException w:name="Medium Grid 1 Accent 2" w:uiPriority="67"/>
+    <w:lsdException w:name="Medium Grid 2 Accent 2" w:uiPriority="68"/>
+    <w:lsdException w:name="Medium Grid 3 Accent 2" w:uiPriority="69"/>
+    <w:lsdException w:name="Dark List Accent 2" w:uiPriority="70"/>
+    <w:lsdException w:name="Colorful Shading Accent 2" w:uiPriority="71"/>
+    <w:lsdException w:name="Colorful List Accent 2" w:uiPriority="72"/>
+    <w:lsdException w:name="Colorful Grid Accent 2" w:uiPriority="73"/>
+    <w:lsdException w:name="Light Shading Accent 3" w:uiPriority="60"/>
+    <w:lsdException w:name="Light List Accent 3" w:uiPriority="61"/>
+    <w:lsdException w:name="Light Grid Accent 3" w:uiPriority="62"/>
+    <w:lsdException w:name="Medium Shading 1 Accent 3" w:uiPriority="63"/>
+    <w:lsdException w:name="Medium Shading 2 Accent 3" w:uiPriority="64"/>
+    <w:lsdException w:name="Medium List 1 Accent 3" w:uiPriority="65"/>
+    <w:lsdException w:name="Medium List 2 Accent 3" w:uiPriority="66"/>
+    <w:lsdException w:name="Medium Grid 1 Accent 3" w:uiPriority="67"/>
+    <w:lsdException w:name="Medium Grid 2 Accent 3" w:uiPriority="68"/>
+    <w:lsdException w:name="Medium Grid 3 Accent 3" w:uiPriority="69"/>
+    <w:lsdException w:name="Dark List Accent 3" w:uiPriority="70"/>
+    <w:lsdException w:name="Colorful Shading Accent 3" w:uiPriority="71"/>
+    <w:lsdException w:name="Colorful List Accent 3" w:uiPriority="72"/>
+    <w:lsdException w:name="Colorful Grid Accent 3" w:uiPriority="73"/>
+    <w:lsdException w:name="Light Shading Accent 4" w:uiPriority="60"/>
+    <w:lsdException w:name="Light List Accent 4" w:uiPriority="61"/>
+    <w:lsdException w:name="Light Grid Accent 4" w:uiPriority="62"/>
+    <w:lsdException w:name="Medium Shading 1 Accent 4" w:uiPriority="63"/>
+    <w:lsdException w:name="Medium Shading 2 Accent 4" w:uiPriority="64"/>
+    <w:lsdException w:name="Medium List 1 Accent 4" w:uiPriority="65"/>
+    <w:lsdException w:name="Medium List 2 Accent 4" w:uiPriority="66"/>
+    <w:lsdException w:name="Medium Grid 1 Accent 4" w:uiPriority="67"/>
+    <w:lsdException w:name="Medium Grid 2 Accent 4" w:uiPriority="68"/>
+    <w:lsdException w:name="Medium Grid 3 Accent 4" w:uiPriority="69"/>
+    <w:lsdException w:name="Dark List Accent 4" w:uiPriority="70"/>
+    <w:lsdException w:name="Colorful Shading Accent 4" w:uiPriority="71"/>
+    <w:lsdException w:name="Colorful List Accent 4" w:uiPriority="72"/>
+    <w:lsdException w:name="Colorful Grid Accent 4" w:uiPriority="73"/>
+    <w:lsdException w:name="Light Shading Accent 5" w:uiPriority="60"/>
+    <w:lsdException w:name="Light List Accent 5" w:uiPriority="61"/>
+    <w:lsdException w:name="Light Grid Accent 5" w:uiPriority="62"/>
+    <w:lsdException w:name="Medium Shading 1 Accent 5" w:uiPriority="63"/>
+    <w:lsdException w:name="Medium Shading 2 Accent 5" w:uiPriority="64"/>
+    <w:lsdException w:name="Medium List 1 Accent 5" w:uiPriority="65"/>
+    <w:lsdException w:name="Medium List 2 Accent 5" w:uiPriority="66"/>
+    <w:lsdException w:name="Medium Grid 1 Accent 5" w:uiPriority="67"/>
+    <w:lsdException w:name="Medium Grid 2 Accent 5" w:uiPriority="68"/>
+    <w:lsdException w:name="Medium Grid 3 Accent 5" w:uiPriority="69"/>
+    <w:lsdException w:name="Dark List Accent 5" w:uiPriority="70"/>
+    <w:lsdException w:name="Colorful Shading Accent 5" w:uiPriority="71"/>
+    <w:lsdException w:name="Colorful List Accent 5" w:uiPriority="72"/>
+    <w:lsdException w:name="Colorful Grid Accent 5" w:uiPriority="73"/>
+    <w:lsdException w:name="Light Shading Accent 6" w:uiPriority="60"/>
+    <w:lsdException w:name="Light List Accent 6" w:uiPriority="61"/>
+    <w:lsdException w:name="Light Grid Accent 6" w:uiPriority="62"/>
+    <w:lsdException w:name="Medium Shading 1 Accent 6" w:uiPriority="63"/>
+    <w:lsdException w:name="Medium Shading 2 Accent 6" w:uiPriority="64"/>
+    <w:lsdException w:name="Medium List 1 Accent 6" w:uiPriority="65"/>
+    <w:lsdException w:name="Medium List 2 Accent 6" w:uiPriority="66"/>
+    <w:lsdException w:name="Medium Grid 1 Accent 6" w:uiPriority="67"/>
+    <w:lsdException w:name="Medium Grid 2 Accent 6" w:uiPriority="68"/>
+    <w:lsdException w:name="Medium Grid 3 Accent 6" w:uiPriority="69"/>
+    <w:lsdException w:name="Dark List Accent 6" w:uiPriority="70"/>
+    <w:lsdException w:name="Colorful Shading Accent 6" w:uiPriority="71"/>
+    <w:lsdException w:name="Colorful List Accent 6" w:uiPriority="72"/>
+    <w:lsdException w:name="Colorful Grid Accent 6" w:uiPriority="73"/>
+    <w:lsdException w:name="Subtle Emphasis" w:uiPriority="19" w:qFormat="1"/>
+    <w:lsdException w:name="Intense Emphasis" w:uiPriority="21" w:qFormat="1"/>
+    <w:lsdException w:name="Subtle Reference" w:uiPriority="31" w:qFormat="1"/>
+    <w:lsdException w:name="Intense Reference" w:uiPriority="32" w:qFormat="1"/>
+    <w:lsdException w:name="Book Title" w:uiPriority="33" w:qFormat="1"/>
+    <w:lsdException w:name="Bibliography" w:semiHidden="1" w:uiPriority="37" w:unhideWhenUsed="1"/>
+    <w:lsdException w:name="TOC Heading" w:semiHidden="1" w:uiPriority="39" w:unhideWhenUsed="1" w:qFormat="1"/>
+    <w:lsdException w:name="Plain Table 1" w:uiPriority="41"/>
+    <w:lsdException w:name="Plain Table 2" w:uiPriority="42"/>
+    <w:lsdException w:name="Plain Table 3" w:uiPriority="43"/>
+    <w:lsdException w:name="Plain Table 4" w:uiPriority="44"/>
+    <w:lsdException w:name="Plain Table 5" w:uiPriority="45"/>
+    <w:lsdException w:name="Grid Table Light" w:uiPriority="40"/>
+    <w:lsdException w:name="Grid Table 1 Light" w:uiPriority="46"/>
+    <w:lsdException w:name="Grid Table 2" w:uiPriority="47"/>
+    <w:lsdException w:name="Grid Table 3" w:uiPriority="48"/>
+    <w:lsdException w:name="Grid Table 4" w:uiPriority="49"/>
+    <w:lsdException w:name="Grid Table 5 Dark" w:uiPriority="50"/>
+    <w:lsdException w:name="Grid Table 6 Colorful" w:uiPriority="51"/>
+    <w:lsdException w:name="Grid Table 7 Colorful" w:uiPriority="52"/>
+    <w:lsdException w:name="Grid Table 1 Light Accent 1" w:uiPriority="46"/>
+    <w:lsdException w:name="Grid Table 2 Accent 1" w:uiPriority="47"/>
+    <w:lsdException w:name="Grid Table 3 Accent 1" w:uiPriority="48"/>
+    <w:lsdException w:name="Grid Table 4 Accent 1" w:uiPriority="49"/>
+    <w:lsdException w:name="Grid Table 5 Dark Accent 1" w:uiPriority="50"/>
+    <w:lsdException w:name="Grid Table 6 Colorful Accent 1" w:uiPriority="51"/>
+    <w:lsdException w:name="Grid Table 7 Colorful Accent 1" w:uiPriority="52"/>
+    <w:lsdException w:name="Grid Table 1 Light Accent 2" w:uiPriority="46"/>
+    <w:lsdException w:name="Grid Table 2 Accent 2" w:uiPriority="47"/>
+    <w:lsdException w:name="Grid Table 3 Accent 2" w:uiPriority="48"/>
+    <w:lsdException w:name="Grid Table 4 Accent 2" w:uiPriority="49"/>
+    <w:lsdException w:name="Grid Table 5 Dark Accent 2" w:uiPriority="50"/>
+    <w:lsdException w:name="Grid Table 6 Colorful Accent 2" w:uiPriority="51"/>
+    <w:lsdException w:name="Grid Table 7 Colorful Accent 2" w:uiPriority="52"/>
+    <w:lsdException w:name="Grid Table 1 Light Accent 3" w:uiPriority="46"/>
+    <w:lsdException w:name="Grid Table 2 Accent 3" w:uiPriority="47"/>
+    <w:lsdException w:name="Grid Table 3 Accent 3" w:uiPriority="48"/>
+    <w:lsdException w:name="Grid Table 4 Accent 3" w:uiPriority="49"/>
+    <w:lsdException w:name="Grid Table 5 Dark Accent 3" w:uiPriority="50"/>
+    <w:lsdException w:name="Grid Table 6 Colorful Accent 3" w:uiPriority="51"/>
+    <w:lsdException w:name="Grid Table 7 Colorful Accent 3" w:uiPriority="52"/>
+    <w:lsdException w:name="Grid Table 1 Light Accent 4" w:uiPriority="46"/>
+    <w:lsdException w:name="Grid Table 2 Accent 4" w:uiPriority="47"/>
+    <w:lsdException w:name="Grid Table 3 Accent 4" w:uiPriority="48"/>
+    <w:lsdException w:name="Grid Table 4 Accent 4" w:uiPriority="49"/>
+    <w:lsdException w:name="Grid Table 5 Dark Accent 4" w:uiPriority="50"/>
+    <w:lsdException w:name="Grid Table 6 Colorful Accent 4" w:uiPriority="51"/>
+    <w:lsdException w:name="Grid Table 7 Colorful Accent 4" w:uiPriority="52"/>
+    <w:lsdException w:name="Grid Table 1 Light Accent 5" w:uiPriority="46"/>
+    <w:lsdException w:name="Grid Table 2 Accent 5" w:uiPriority="47"/>
+    <w:lsdException w:name="Grid Table 3 Accent 5" w:uiPriority="48"/>
+    <w:lsdException w:name="Grid Table 4 Accent 5" w:uiPriority="49"/>
+    <w:lsdException w:name="Grid Table 5 Dark Accent 5" w:uiPriority="50"/>
+    <w:lsdException w:name="Grid Table 6 Colorful Accent 5" w:uiPriority="51"/>
+    <w:lsdException w:name="Grid Table 7 Colorful Accent 5" w:uiPriority="52"/>
+    <w:lsdException w:name="Grid Table 1 Light Accent 6" w:uiPriority="46"/>
+    <w:lsdException w:name="Grid Table 2 Accent 6" w:uiPriority="47"/>
+    <w:lsdException w:name="Grid Table 3 Accent 6" w:uiPriority="48"/>
+    <w:lsdException w:name="Grid Table 4 Accent 6" w:uiPriority="49"/>
+    <w:lsdException w:name="Grid Table 5 Dark Accent 6" w:uiPriority="50"/>
+    <w:lsdException w:name="Grid Table 6 Colorful Accent 6" w:uiPriority="51"/>
+    <w:lsdException w:name="Grid Table 7 Colorful Accent 6" w:uiPriority="52"/>
+    <w:lsdException w:name="List Table 1 Light" w:uiPriority="46"/>
+    <w:lsdException w:name="List Table 2" w:uiPriority="47"/>
+    <w:lsdException w:name="List Table 3" w:uiPriority="48"/>
+    <w:lsdException w:name="List Table 4" w:uiPriority="49"/>
+    <w:lsdException w:name="List Table 5 Dark" w:uiPriority="50"/>
+    <w:lsdException w:name="List Table 6 Colorful" w:uiPriority="51"/>
+    <w:lsdException w:name="List Table 7 Colorful" w:uiPriority="52"/>
+    <w:lsdException w:name="List Table 1 Light Accent 1" w:uiPriority="46"/>
+    <w:lsdException w:name="List Table 2 Accent 1" w:uiPriority="47"/>
+    <w:lsdException w:name="List Table 3 Accent 1" w:uiPriority="48"/>
+    <w:lsdException w:name="List Table 4 Accent 1" w:uiPriority="49"/>
+    <w:lsdException w:name="List Table 5 Dark Accent 1" w:uiPriority="50"/>
+    <w:lsdException w:name="List Table 6 Colorful Accent 1" w:uiPriority="51"/>
+    <w:lsdException w:name="List Table 7 Colorful Accent 1" w:uiPriority="52"/>
+    <w:lsdException w:name="List Table 1 Light Accent 2" w:uiPriority="46"/>
+    <w:lsdException w:name="List Table 2 Accent 2" w:uiPriority="47"/>
+    <w:lsdException w:name="List Table 3 Accent 2" w:uiPriority="48"/>
+    <w:lsdException w:name="List Table 4 Accent 2" w:uiPriority="49"/>
+    <w:lsdException w:name="List Table 5 Dark Accent 2" w:uiPriority="50"/>
+    <w:lsdException w:name="List Table 6 Colorful Accent 2" w:uiPriority="51"/>
+    <w:lsdException w:name="List Table 7 Colorful Accent 2" w:uiPriority="52"/>
+    <w:lsdException w:name="List Table 1 Light Accent 3" w:uiPriority="46"/>
+    <w:lsdException w:name="List Table 2 Accent 3" w:uiPriority="47"/>
+    <w:lsdException w:name="List Table 3 Accent 3" w:uiPriority="48"/>
+    <w:lsdException w:name="List Table 4 Accent 3" w:uiPriority="49"/>
+    <w:lsdException w:name="List Table 5 Dark Accent 3" w:uiPriority="50"/>
+    <w:lsdException w:name="List Table 6 Colorful Accent 3" w:uiPriority="51"/>
+    <w:lsdException w:name="List Table 7 Colorful Accent 3" w:uiPriority="52"/>
+    <w:lsdException w:name="List Table 1 Light Accent 4" w:uiPriority="46"/>
+    <w:lsdException w:name="List Table 2 Accent 4" w:uiPriority="47"/>
+    <w:lsdException w:name="List Table 3 Accent 4" w:uiPriority="48"/>
+    <w:lsdException w:name="List Table 4 Accent 4" w:uiPriority="49"/>
+    <w:lsdException w:name="List Table 5 Dark Accent 4" w:uiPriority="50"/>
+    <w:lsdException w:name="List Table 6 Colorful Accent 4" w:uiPriority="51"/>
+    <w:lsdException w:name="List Table 7 Colorful Accent 4" w:uiPriority="52"/>
+    <w:lsdException w:name="List Table 1 Light Accent 5" w:uiPriority="46"/>
+    <w:lsdException w:name="List Table 2 Accent 5" w:uiPriority="47"/>
+    <w:lsdException w:name="List Table 3 Accent 5" w:uiPriority="48"/>
+    <w:lsdException w:name="List Table 4 Accent 5" w:uiPriority="49"/>
+    <w:lsdException w:name="List Table 5 Dark Accent 5" w:uiPriority="50"/>
+    <w:lsdException w:name="List Table 6 Colorful Accent 5" w:uiPriority="51"/>
+    <w:lsdException w:name="List Table 7 Colorful Accent 5" w:uiPriority="52"/>
+    <w:lsdException w:name="List Table 1 Light Accent 6" w:uiPriority="46"/>
+    <w:lsdException w:name="List Table 2 Accent 6" w:uiPriority="47"/>
+    <w:lsdException w:name="List Table 3 Accent 6" w:uiPriority="48"/>
+    <w:lsdException w:name="List Table 4 Accent 6" w:uiPriority="49"/>
+    <w:lsdException w:name="List Table 5 Dark Accent 6" w:uiPriority="50"/>
+    <w:lsdException w:name="List Table 6 Colorful Accent 6" w:uiPriority="51"/>
+    <w:lsdException w:name="List Table 7 Colorful Accent 6" w:uiPriority="52"/>
+    <w:lsdException w:name="Mention" w:semiHidden="1" w:unhideWhenUsed="1"/>
+    <w:lsdException w:name="Smart Hyperlink" w:semiHidden="1" w:unhideWhenUsed="1"/>
+    <w:lsdException w:name="Hashtag" w:semiHidden="1" w:unhideWhenUsed="1"/>
+    <w:lsdException w:name="Unresolved Mention" w:semiHidden="1" w:unhideWhenUsed="1"/>
+    <w:lsdException w:name="Smart Link" w:semiHidden="1" w:unhideWhenUsed="1"/>
   </w:latentStyles>
   <w:style w:type="paragraph" w:default="1" w:styleId="Normal">
     <w:name w:val="Normal"/>
@@ -8850,7 +10517,6 @@
     <w:uiPriority w:val="99"/>
     <w:semiHidden/>
     <w:unhideWhenUsed/>
-    <w:qFormat/>
     <w:tblPr>
       <w:tblInd w:w="0" w:type="dxa"/>
       <w:tblCellMar>

</xml_diff>

<commit_message>
Replace Kdt with Kds in LRFD Eq. 5.7.3.4.2-4 (#45)
</commit_message>
<xml_diff>
--- a/Equations/ex.docx
+++ b/Equations/ex.docx
@@ -1,6 +1,6 @@
 
 <file path=word/document.xml><?xml version="1.0" encoding="utf-8"?>
-<w:document xmlns:wpc="http://schemas.microsoft.com/office/word/2010/wordprocessingCanvas" xmlns:cx="http://schemas.microsoft.com/office/drawing/2014/chartex" xmlns:cx1="http://schemas.microsoft.com/office/drawing/2015/9/8/chartex" xmlns:cx2="http://schemas.microsoft.com/office/drawing/2015/10/21/chartex" xmlns:cx3="http://schemas.microsoft.com/office/drawing/2016/5/9/chartex" xmlns:cx4="http://schemas.microsoft.com/office/drawing/2016/5/10/chartex" xmlns:cx5="http://schemas.microsoft.com/office/drawing/2016/5/11/chartex" xmlns:cx6="http://schemas.microsoft.com/office/drawing/2016/5/12/chartex" xmlns:cx7="http://schemas.microsoft.com/office/drawing/2016/5/13/chartex" xmlns:cx8="http://schemas.microsoft.com/office/drawing/2016/5/14/chartex" xmlns:mc="http://schemas.openxmlformats.org/markup-compatibility/2006" xmlns:aink="http://schemas.microsoft.com/office/drawing/2016/ink" xmlns:am3d="http://schemas.microsoft.com/office/drawing/2017/model3d" xmlns:o="urn:schemas-microsoft-com:office:office" xmlns:oel="http://schemas.microsoft.com/office/2019/extlst" xmlns:r="http://schemas.openxmlformats.org/officeDocument/2006/relationships" xmlns:m="http://schemas.openxmlformats.org/officeDocument/2006/math" xmlns:v="urn:schemas-microsoft-com:vml" xmlns:wp14="http://schemas.microsoft.com/office/word/2010/wordprocessingDrawing" xmlns:wp="http://schemas.openxmlformats.org/drawingml/2006/wordprocessingDrawing" xmlns:w10="urn:schemas-microsoft-com:office:word" xmlns:w="http://schemas.openxmlformats.org/wordprocessingml/2006/main" xmlns:w14="http://schemas.microsoft.com/office/word/2010/wordml" xmlns:w15="http://schemas.microsoft.com/office/word/2012/wordml" xmlns:w16cex="http://schemas.microsoft.com/office/word/2018/wordml/cex" xmlns:w16cid="http://schemas.microsoft.com/office/word/2016/wordml/cid" xmlns:w16="http://schemas.microsoft.com/office/word/2018/wordml" xmlns:w16du="http://schemas.microsoft.com/office/word/2023/wordml/word16du" xmlns:w16sdtdh="http://schemas.microsoft.com/office/word/2020/wordml/sdtdatahash" xmlns:w16se="http://schemas.microsoft.com/office/word/2015/wordml/symex" xmlns:wpg="http://schemas.microsoft.com/office/word/2010/wordprocessingGroup" xmlns:wpi="http://schemas.microsoft.com/office/word/2010/wordprocessingInk" xmlns:wne="http://schemas.microsoft.com/office/word/2006/wordml" xmlns:wps="http://schemas.microsoft.com/office/word/2010/wordprocessingShape" mc:Ignorable="w14 w15 w16se w16cid w16 w16cex w16sdtdh w16du wp14">
+<w:document xmlns:wpc="http://schemas.microsoft.com/office/word/2010/wordprocessingCanvas" xmlns:cx="http://schemas.microsoft.com/office/drawing/2014/chartex" xmlns:cx1="http://schemas.microsoft.com/office/drawing/2015/9/8/chartex" xmlns:cx2="http://schemas.microsoft.com/office/drawing/2015/10/21/chartex" xmlns:cx3="http://schemas.microsoft.com/office/drawing/2016/5/9/chartex" xmlns:cx4="http://schemas.microsoft.com/office/drawing/2016/5/10/chartex" xmlns:cx5="http://schemas.microsoft.com/office/drawing/2016/5/11/chartex" xmlns:cx6="http://schemas.microsoft.com/office/drawing/2016/5/12/chartex" xmlns:cx7="http://schemas.microsoft.com/office/drawing/2016/5/13/chartex" xmlns:cx8="http://schemas.microsoft.com/office/drawing/2016/5/14/chartex" xmlns:mc="http://schemas.openxmlformats.org/markup-compatibility/2006" xmlns:aink="http://schemas.microsoft.com/office/drawing/2016/ink" xmlns:am3d="http://schemas.microsoft.com/office/drawing/2017/model3d" xmlns:o="urn:schemas-microsoft-com:office:office" xmlns:oel="http://schemas.microsoft.com/office/2019/extlst" xmlns:r="http://schemas.openxmlformats.org/officeDocument/2006/relationships" xmlns:m="http://schemas.openxmlformats.org/officeDocument/2006/math" xmlns:v="urn:schemas-microsoft-com:vml" xmlns:wp14="http://schemas.microsoft.com/office/word/2010/wordprocessingDrawing" xmlns:wp="http://schemas.openxmlformats.org/drawingml/2006/wordprocessingDrawing" xmlns:w10="urn:schemas-microsoft-com:office:word" xmlns:w="http://schemas.openxmlformats.org/wordprocessingml/2006/main" xmlns:w14="http://schemas.microsoft.com/office/word/2010/wordml" xmlns:w15="http://schemas.microsoft.com/office/word/2012/wordml" xmlns:w16cex="http://schemas.microsoft.com/office/word/2018/wordml/cex" xmlns:w16cid="http://schemas.microsoft.com/office/word/2016/wordml/cid" xmlns:w16="http://schemas.microsoft.com/office/word/2018/wordml" xmlns:w16du="http://schemas.microsoft.com/office/word/2023/wordml/word16du" xmlns:w16sdtdh="http://schemas.microsoft.com/office/word/2020/wordml/sdtdatahash" xmlns:w16sdtfl="http://schemas.microsoft.com/office/word/2024/wordml/sdtformatlock" xmlns:w16se="http://schemas.microsoft.com/office/word/2015/wordml/symex" xmlns:wpg="http://schemas.microsoft.com/office/word/2010/wordprocessingGroup" xmlns:wpi="http://schemas.microsoft.com/office/word/2010/wordprocessingInk" xmlns:wne="http://schemas.microsoft.com/office/word/2006/wordml" xmlns:wps="http://schemas.microsoft.com/office/word/2010/wordprocessingShape" mc:Ignorable="w14 w15 w16se w16cid w16 w16cex w16sdtdh w16sdtfl w16du wp14">
   <w:body>
     <w:p>
       <w:pPr>
@@ -348,7 +348,13 @@
                                   <w:rPr>
                                     <w:rFonts w:ascii="Cambria Math" w:hAnsi="Cambria Math"/>
                                   </w:rPr>
-                                  <m:t>dt</m:t>
+                                  <m:t>d</m:t>
+                                </m:r>
+                                <m:r>
+                                  <w:rPr>
+                                    <w:rFonts w:ascii="Cambria Math" w:hAnsi="Cambria Math"/>
+                                  </w:rPr>
+                                  <m:t>s</m:t>
                                 </m:r>
                               </m:sub>
                             </m:sSub>
@@ -891,7 +897,13 @@
                                   <w:rPr>
                                     <w:rFonts w:ascii="Cambria Math" w:hAnsi="Cambria Math"/>
                                   </w:rPr>
-                                  <m:t>dt</m:t>
+                                  <m:t>d</m:t>
+                                </m:r>
+                                <m:r>
+                                  <w:rPr>
+                                    <w:rFonts w:ascii="Cambria Math" w:hAnsi="Cambria Math"/>
+                                  </w:rPr>
+                                  <m:t>s</m:t>
                                 </m:r>
                               </m:sub>
                             </m:sSub>
@@ -1416,7 +1428,13 @@
                                   <w:rPr>
                                     <w:rFonts w:ascii="Cambria Math" w:hAnsi="Cambria Math"/>
                                   </w:rPr>
-                                  <m:t>dt</m:t>
+                                  <m:t>d</m:t>
+                                </m:r>
+                                <m:r>
+                                  <w:rPr>
+                                    <w:rFonts w:ascii="Cambria Math" w:hAnsi="Cambria Math"/>
+                                  </w:rPr>
+                                  <m:t>s</m:t>
                                 </m:r>
                               </m:sub>
                             </m:sSub>
@@ -2040,7 +2058,13 @@
                                   <w:rPr>
                                     <w:rFonts w:ascii="Cambria Math" w:hAnsi="Cambria Math"/>
                                   </w:rPr>
-                                  <m:t>dt</m:t>
+                                  <m:t>d</m:t>
+                                </m:r>
+                                <m:r>
+                                  <w:rPr>
+                                    <w:rFonts w:ascii="Cambria Math" w:hAnsi="Cambria Math"/>
+                                  </w:rPr>
+                                  <m:t>s</m:t>
                                 </m:r>
                               </m:sub>
                             </m:sSub>
@@ -2583,7 +2607,13 @@
                                   <w:rPr>
                                     <w:rFonts w:ascii="Cambria Math" w:hAnsi="Cambria Math"/>
                                   </w:rPr>
-                                  <m:t>dt</m:t>
+                                  <m:t>d</m:t>
+                                </m:r>
+                                <m:r>
+                                  <w:rPr>
+                                    <w:rFonts w:ascii="Cambria Math" w:hAnsi="Cambria Math"/>
+                                  </w:rPr>
+                                  <m:t>s</m:t>
                                 </m:r>
                               </m:sub>
                             </m:sSub>
@@ -3108,7 +3138,13 @@
                                   <w:rPr>
                                     <w:rFonts w:ascii="Cambria Math" w:hAnsi="Cambria Math"/>
                                   </w:rPr>
-                                  <m:t>dt</m:t>
+                                  <m:t>d</m:t>
+                                </m:r>
+                                <m:r>
+                                  <w:rPr>
+                                    <w:rFonts w:ascii="Cambria Math" w:hAnsi="Cambria Math"/>
+                                  </w:rPr>
+                                  <m:t>s</m:t>
                                 </m:r>
                               </m:sub>
                             </m:sSub>
@@ -3734,7 +3770,13 @@
                                   <w:rPr>
                                     <w:rFonts w:ascii="Cambria Math" w:hAnsi="Cambria Math"/>
                                   </w:rPr>
-                                  <m:t>dt</m:t>
+                                  <m:t>d</m:t>
+                                </m:r>
+                                <m:r>
+                                  <w:rPr>
+                                    <w:rFonts w:ascii="Cambria Math" w:hAnsi="Cambria Math"/>
+                                  </w:rPr>
+                                  <m:t>s</m:t>
                                 </m:r>
                               </m:sub>
                             </m:sSub>
@@ -4279,7 +4321,13 @@
                                   <w:rPr>
                                     <w:rFonts w:ascii="Cambria Math" w:hAnsi="Cambria Math"/>
                                   </w:rPr>
-                                  <m:t>dt</m:t>
+                                  <m:t>d</m:t>
+                                </m:r>
+                                <m:r>
+                                  <w:rPr>
+                                    <w:rFonts w:ascii="Cambria Math" w:hAnsi="Cambria Math"/>
+                                  </w:rPr>
+                                  <m:t>s</m:t>
                                 </m:r>
                               </m:sub>
                             </m:sSub>
@@ -4806,7 +4854,13 @@
                                   <w:rPr>
                                     <w:rFonts w:ascii="Cambria Math" w:hAnsi="Cambria Math"/>
                                   </w:rPr>
-                                  <m:t>dt</m:t>
+                                  <m:t>d</m:t>
+                                </m:r>
+                                <m:r>
+                                  <w:rPr>
+                                    <w:rFonts w:ascii="Cambria Math" w:hAnsi="Cambria Math"/>
+                                  </w:rPr>
+                                  <m:t>s</m:t>
                                 </m:r>
                               </m:sub>
                             </m:sSub>
@@ -5417,7 +5471,13 @@
                                   <w:rPr>
                                     <w:rFonts w:ascii="Cambria Math" w:hAnsi="Cambria Math"/>
                                   </w:rPr>
-                                  <m:t>dt</m:t>
+                                  <m:t>d</m:t>
+                                </m:r>
+                                <m:r>
+                                  <w:rPr>
+                                    <w:rFonts w:ascii="Cambria Math" w:hAnsi="Cambria Math"/>
+                                  </w:rPr>
+                                  <m:t>s</m:t>
                                 </m:r>
                               </m:sub>
                             </m:sSub>
@@ -5943,7 +6003,13 @@
                               <w:rPr>
                                 <w:rFonts w:ascii="Cambria Math" w:hAnsi="Cambria Math"/>
                               </w:rPr>
-                              <m:t>dt</m:t>
+                              <m:t>d</m:t>
+                            </m:r>
+                            <m:r>
+                              <w:rPr>
+                                <w:rFonts w:ascii="Cambria Math" w:hAnsi="Cambria Math"/>
+                              </w:rPr>
+                              <m:t>s</m:t>
                             </m:r>
                           </m:sub>
                         </m:sSub>
@@ -6591,7 +6657,13 @@
                                   <w:rPr>
                                     <w:rFonts w:ascii="Cambria Math" w:hAnsi="Cambria Math"/>
                                   </w:rPr>
-                                  <m:t>dt</m:t>
+                                  <m:t>d</m:t>
+                                </m:r>
+                                <m:r>
+                                  <w:rPr>
+                                    <w:rFonts w:ascii="Cambria Math" w:hAnsi="Cambria Math"/>
+                                  </w:rPr>
+                                  <m:t>s</m:t>
                                 </m:r>
                               </m:sub>
                             </m:sSub>
@@ -7136,7 +7208,13 @@
                                   <w:rPr>
                                     <w:rFonts w:ascii="Cambria Math" w:hAnsi="Cambria Math"/>
                                   </w:rPr>
-                                  <m:t>dt</m:t>
+                                  <m:t>d</m:t>
+                                </m:r>
+                                <m:r>
+                                  <w:rPr>
+                                    <w:rFonts w:ascii="Cambria Math" w:hAnsi="Cambria Math"/>
+                                  </w:rPr>
+                                  <m:t>s</m:t>
                                 </m:r>
                               </m:sub>
                             </m:sSub>
@@ -7663,7 +7741,13 @@
                                   <w:rPr>
                                     <w:rFonts w:ascii="Cambria Math" w:hAnsi="Cambria Math"/>
                                   </w:rPr>
-                                  <m:t>dt</m:t>
+                                  <m:t>d</m:t>
+                                </m:r>
+                                <m:r>
+                                  <w:rPr>
+                                    <w:rFonts w:ascii="Cambria Math" w:hAnsi="Cambria Math"/>
+                                  </w:rPr>
+                                  <m:t>s</m:t>
                                 </m:r>
                               </m:sub>
                             </m:sSub>
@@ -8289,7 +8373,13 @@
                                   <w:rPr>
                                     <w:rFonts w:ascii="Cambria Math" w:hAnsi="Cambria Math"/>
                                   </w:rPr>
-                                  <m:t>dt</m:t>
+                                  <m:t>d</m:t>
+                                </m:r>
+                                <m:r>
+                                  <w:rPr>
+                                    <w:rFonts w:ascii="Cambria Math" w:hAnsi="Cambria Math"/>
+                                  </w:rPr>
+                                  <m:t>s</m:t>
                                 </m:r>
                               </m:sub>
                             </m:sSub>
@@ -8834,7 +8924,13 @@
                                   <w:rPr>
                                     <w:rFonts w:ascii="Cambria Math" w:hAnsi="Cambria Math"/>
                                   </w:rPr>
-                                  <m:t>dt</m:t>
+                                  <m:t>d</m:t>
+                                </m:r>
+                                <m:r>
+                                  <w:rPr>
+                                    <w:rFonts w:ascii="Cambria Math" w:hAnsi="Cambria Math"/>
+                                  </w:rPr>
+                                  <m:t>s</m:t>
                                 </m:r>
                               </m:sub>
                             </m:sSub>
@@ -9361,7 +9457,13 @@
                                   <w:rPr>
                                     <w:rFonts w:ascii="Cambria Math" w:hAnsi="Cambria Math"/>
                                   </w:rPr>
-                                  <m:t>dt</m:t>
+                                  <m:t>d</m:t>
+                                </m:r>
+                                <m:r>
+                                  <w:rPr>
+                                    <w:rFonts w:ascii="Cambria Math" w:hAnsi="Cambria Math"/>
+                                  </w:rPr>
+                                  <m:t>s</m:t>
                                 </m:r>
                               </m:sub>
                             </m:sSub>
@@ -9907,7 +10009,13 @@
                         <w:rPr>
                           <w:rFonts w:ascii="Cambria Math" w:hAnsi="Cambria Math"/>
                         </w:rPr>
-                        <m:t>dt</m:t>
+                        <m:t>d</m:t>
+                      </m:r>
+                      <m:r>
+                        <w:rPr>
+                          <w:rFonts w:ascii="Cambria Math" w:hAnsi="Cambria Math"/>
+                        </w:rPr>
+                        <m:t>s</m:t>
                       </m:r>
                     </m:sub>
                   </m:sSub>
@@ -10107,7 +10215,7 @@
 </file>
 
 <file path=word/styles.xml><?xml version="1.0" encoding="utf-8"?>
-<w:styles xmlns:mc="http://schemas.openxmlformats.org/markup-compatibility/2006" xmlns:r="http://schemas.openxmlformats.org/officeDocument/2006/relationships" xmlns:w="http://schemas.openxmlformats.org/wordprocessingml/2006/main" xmlns:w14="http://schemas.microsoft.com/office/word/2010/wordml" xmlns:w15="http://schemas.microsoft.com/office/word/2012/wordml" xmlns:w16cex="http://schemas.microsoft.com/office/word/2018/wordml/cex" xmlns:w16cid="http://schemas.microsoft.com/office/word/2016/wordml/cid" xmlns:w16="http://schemas.microsoft.com/office/word/2018/wordml" xmlns:w16du="http://schemas.microsoft.com/office/word/2023/wordml/word16du" xmlns:w16sdtdh="http://schemas.microsoft.com/office/word/2020/wordml/sdtdatahash" xmlns:w16se="http://schemas.microsoft.com/office/word/2015/wordml/symex" mc:Ignorable="w14 w15 w16se w16cid w16 w16cex w16sdtdh w16du">
+<w:styles xmlns:mc="http://schemas.openxmlformats.org/markup-compatibility/2006" xmlns:r="http://schemas.openxmlformats.org/officeDocument/2006/relationships" xmlns:w="http://schemas.openxmlformats.org/wordprocessingml/2006/main" xmlns:w14="http://schemas.microsoft.com/office/word/2010/wordml" xmlns:w15="http://schemas.microsoft.com/office/word/2012/wordml" xmlns:w16cex="http://schemas.microsoft.com/office/word/2018/wordml/cex" xmlns:w16cid="http://schemas.microsoft.com/office/word/2016/wordml/cid" xmlns:w16="http://schemas.microsoft.com/office/word/2018/wordml" xmlns:w16du="http://schemas.microsoft.com/office/word/2023/wordml/word16du" xmlns:w16sdtdh="http://schemas.microsoft.com/office/word/2020/wordml/sdtdatahash" xmlns:w16sdtfl="http://schemas.microsoft.com/office/word/2024/wordml/sdtformatlock" xmlns:w16se="http://schemas.microsoft.com/office/word/2015/wordml/symex" mc:Ignorable="w14 w15 w16se w16cid w16 w16cex w16sdtdh w16sdtfl w16du">
   <w:docDefaults>
     <w:rPrDefault>
       <w:rPr>

</xml_diff>